<commit_message>
Fix: Attic declaration fields, template versioning, and DB migration 1.0.1
</commit_message>
<xml_diff>
--- a/Padlás födém szigetelés dokumentum managment/templates/kivitelezesi_szerzodes.docx
+++ b/Padlás födém szigetelés dokumentum managment/templates/kivitelezesi_szerzodes.docx
@@ -929,15 +929,7 @@
       <w:tblPr>
         <w:tblStyle w:val="2"/>
         <w:tblW w:w="9214" w:type="dxa"/>
-        <w:tblInd w:w="-134" w:type="dxa"/>
-        <w:tblBorders>
-          <w:top w:val="single" w:sz="6" w:space="0" w:color="000000"/>
-          <w:left w:val="single" w:sz="6" w:space="0" w:color="000000"/>
-          <w:bottom w:val="single" w:sz="6" w:space="0" w:color="000000"/>
-          <w:right w:val="single" w:sz="6" w:space="0" w:color="000000"/>
-          <w:insideH w:val="single" w:sz="6" w:space="0" w:color="000000"/>
-          <w:insideV w:val="single" w:sz="6" w:space="0" w:color="000000"/>
-        </w:tblBorders>
+        <w:tblInd w:w="-126" w:type="dxa"/>
         <w:tblLayout w:type="fixed"/>
         <w:tblLook w:val="0000" w:firstRow="0" w:lastRow="0" w:firstColumn="0" w:lastColumn="0" w:noHBand="0" w:noVBand="0"/>
       </w:tblPr>
@@ -952,12 +944,7 @@
         <w:tc>
           <w:tcPr>
             <w:tcW w:w="4321" w:type="dxa"/>
-            <w:tcBorders>
-              <w:top w:val="single" w:sz="6" w:space="0" w:color="000000"/>
-              <w:left w:val="single" w:sz="6" w:space="0" w:color="000000"/>
-              <w:bottom w:val="single" w:sz="6" w:space="0" w:color="000000"/>
-              <w:right w:val="single" w:sz="6" w:space="0" w:color="000000"/>
-            </w:tcBorders>
+            <w:hideMark/>
           </w:tcPr>
           <w:p>
             <w:pPr>
@@ -1007,12 +994,6 @@
         <w:tc>
           <w:tcPr>
             <w:tcW w:w="4893" w:type="dxa"/>
-            <w:tcBorders>
-              <w:top w:val="single" w:sz="6" w:space="0" w:color="000000"/>
-              <w:left w:val="single" w:sz="6" w:space="0" w:color="000000"/>
-              <w:bottom w:val="single" w:sz="6" w:space="0" w:color="000000"/>
-              <w:right w:val="single" w:sz="6" w:space="0" w:color="000000"/>
-            </w:tcBorders>
           </w:tcPr>
           <w:p>
             <w:pPr>
@@ -1055,12 +1036,7 @@
         <w:tc>
           <w:tcPr>
             <w:tcW w:w="4321" w:type="dxa"/>
-            <w:tcBorders>
-              <w:top w:val="single" w:sz="6" w:space="0" w:color="000000"/>
-              <w:left w:val="single" w:sz="6" w:space="0" w:color="000000"/>
-              <w:bottom w:val="single" w:sz="6" w:space="0" w:color="000000"/>
-              <w:right w:val="single" w:sz="6" w:space="0" w:color="000000"/>
-            </w:tcBorders>
+            <w:hideMark/>
           </w:tcPr>
           <w:p>
             <w:pPr>
@@ -1107,12 +1083,6 @@
         <w:tc>
           <w:tcPr>
             <w:tcW w:w="4893" w:type="dxa"/>
-            <w:tcBorders>
-              <w:top w:val="single" w:sz="6" w:space="0" w:color="000000"/>
-              <w:left w:val="single" w:sz="6" w:space="0" w:color="000000"/>
-              <w:bottom w:val="single" w:sz="6" w:space="0" w:color="000000"/>
-              <w:right w:val="single" w:sz="6" w:space="0" w:color="000000"/>
-            </w:tcBorders>
           </w:tcPr>
           <w:p>
             <w:pPr>
@@ -1179,12 +1149,7 @@
         <w:tc>
           <w:tcPr>
             <w:tcW w:w="4321" w:type="dxa"/>
-            <w:tcBorders>
-              <w:top w:val="single" w:sz="6" w:space="0" w:color="000000"/>
-              <w:left w:val="single" w:sz="6" w:space="0" w:color="000000"/>
-              <w:bottom w:val="single" w:sz="6" w:space="0" w:color="000000"/>
-              <w:right w:val="single" w:sz="6" w:space="0" w:color="000000"/>
-            </w:tcBorders>
+            <w:hideMark/>
           </w:tcPr>
           <w:p>
             <w:pPr>
@@ -1242,12 +1207,6 @@
         <w:tc>
           <w:tcPr>
             <w:tcW w:w="4893" w:type="dxa"/>
-            <w:tcBorders>
-              <w:top w:val="single" w:sz="6" w:space="0" w:color="000000"/>
-              <w:left w:val="single" w:sz="6" w:space="0" w:color="000000"/>
-              <w:bottom w:val="single" w:sz="6" w:space="0" w:color="000000"/>
-              <w:right w:val="single" w:sz="6" w:space="0" w:color="000000"/>
-            </w:tcBorders>
           </w:tcPr>
           <w:p>
             <w:pPr>
@@ -1290,12 +1249,7 @@
         <w:tc>
           <w:tcPr>
             <w:tcW w:w="4321" w:type="dxa"/>
-            <w:tcBorders>
-              <w:top w:val="single" w:sz="6" w:space="0" w:color="000000"/>
-              <w:left w:val="single" w:sz="6" w:space="0" w:color="000000"/>
-              <w:bottom w:val="single" w:sz="6" w:space="0" w:color="000000"/>
-              <w:right w:val="single" w:sz="6" w:space="0" w:color="000000"/>
-            </w:tcBorders>
+            <w:hideMark/>
           </w:tcPr>
           <w:p>
             <w:pPr>
@@ -1342,12 +1296,6 @@
         <w:tc>
           <w:tcPr>
             <w:tcW w:w="4893" w:type="dxa"/>
-            <w:tcBorders>
-              <w:top w:val="single" w:sz="6" w:space="0" w:color="000000"/>
-              <w:left w:val="single" w:sz="6" w:space="0" w:color="000000"/>
-              <w:bottom w:val="single" w:sz="6" w:space="0" w:color="000000"/>
-              <w:right w:val="single" w:sz="6" w:space="0" w:color="000000"/>
-            </w:tcBorders>
           </w:tcPr>
           <w:p>
             <w:pPr>
@@ -1390,12 +1338,7 @@
         <w:tc>
           <w:tcPr>
             <w:tcW w:w="4321" w:type="dxa"/>
-            <w:tcBorders>
-              <w:top w:val="single" w:sz="6" w:space="0" w:color="000000"/>
-              <w:left w:val="single" w:sz="6" w:space="0" w:color="000000"/>
-              <w:bottom w:val="single" w:sz="6" w:space="0" w:color="000000"/>
-              <w:right w:val="single" w:sz="6" w:space="0" w:color="000000"/>
-            </w:tcBorders>
+            <w:hideMark/>
           </w:tcPr>
           <w:p>
             <w:pPr>
@@ -1462,12 +1405,6 @@
         <w:tc>
           <w:tcPr>
             <w:tcW w:w="4893" w:type="dxa"/>
-            <w:tcBorders>
-              <w:top w:val="single" w:sz="6" w:space="0" w:color="000000"/>
-              <w:left w:val="single" w:sz="6" w:space="0" w:color="000000"/>
-              <w:bottom w:val="single" w:sz="6" w:space="0" w:color="000000"/>
-              <w:right w:val="single" w:sz="6" w:space="0" w:color="000000"/>
-            </w:tcBorders>
           </w:tcPr>
           <w:p>
             <w:pPr>
@@ -1503,12 +1440,416 @@
         <w:tc>
           <w:tcPr>
             <w:tcW w:w="4321" w:type="dxa"/>
-            <w:tcBorders>
-              <w:top w:val="single" w:sz="6" w:space="0" w:color="000000"/>
-              <w:left w:val="single" w:sz="6" w:space="0" w:color="000000"/>
-              <w:bottom w:val="single" w:sz="6" w:space="0" w:color="000000"/>
-              <w:right w:val="single" w:sz="6" w:space="0" w:color="000000"/>
-            </w:tcBorders>
+          </w:tcPr>
+          <w:p>
+            <w:pPr>
+              <w:pBdr>
+                <w:top w:val="nil"/>
+                <w:left w:val="nil"/>
+                <w:bottom w:val="nil"/>
+                <w:right w:val="nil"/>
+                <w:between w:val="nil"/>
+              </w:pBdr>
+              <w:ind w:left="93"/>
+              <w:rPr>
+                <w:rFonts w:ascii="Times New Roman" w:eastAsia="Times New Roman" w:hAnsi="Times New Roman" w:cs="Times New Roman"/>
+                <w:color w:val="000000"/>
+                <w:sz w:val="21"/>
+                <w:szCs w:val="21"/>
+              </w:rPr>
+            </w:pPr>
+            <w:r>
+              <w:rPr>
+                <w:rFonts w:ascii="Times New Roman" w:eastAsia="Times New Roman" w:hAnsi="Times New Roman" w:cs="Times New Roman"/>
+                <w:color w:val="000000"/>
+                <w:sz w:val="21"/>
+                <w:szCs w:val="21"/>
+              </w:rPr>
+              <w:t xml:space="preserve">MKIK </w:t>
+            </w:r>
+            <w:proofErr w:type="spellStart"/>
+            <w:r>
+              <w:rPr>
+                <w:rFonts w:ascii="Times New Roman" w:eastAsia="Times New Roman" w:hAnsi="Times New Roman" w:cs="Times New Roman"/>
+                <w:color w:val="000000"/>
+                <w:sz w:val="21"/>
+                <w:szCs w:val="21"/>
+              </w:rPr>
+              <w:t>regisztrációs</w:t>
+            </w:r>
+            <w:proofErr w:type="spellEnd"/>
+            <w:r>
+              <w:rPr>
+                <w:rFonts w:ascii="Times New Roman" w:eastAsia="Times New Roman" w:hAnsi="Times New Roman" w:cs="Times New Roman"/>
+                <w:color w:val="000000"/>
+                <w:sz w:val="21"/>
+                <w:szCs w:val="21"/>
+              </w:rPr>
+              <w:t xml:space="preserve"> </w:t>
+            </w:r>
+            <w:proofErr w:type="spellStart"/>
+            <w:r>
+              <w:rPr>
+                <w:rFonts w:ascii="Times New Roman" w:eastAsia="Times New Roman" w:hAnsi="Times New Roman" w:cs="Times New Roman"/>
+                <w:color w:val="000000"/>
+                <w:sz w:val="21"/>
+                <w:szCs w:val="21"/>
+              </w:rPr>
+              <w:t>szám</w:t>
+            </w:r>
+            <w:proofErr w:type="spellEnd"/>
+            <w:r>
+              <w:rPr>
+                <w:rFonts w:ascii="Times New Roman" w:eastAsia="Times New Roman" w:hAnsi="Times New Roman" w:cs="Times New Roman"/>
+                <w:color w:val="000000"/>
+                <w:sz w:val="21"/>
+                <w:szCs w:val="21"/>
+              </w:rPr>
+              <w:t>:</w:t>
+            </w:r>
+          </w:p>
+        </w:tc>
+        <w:tc>
+          <w:tcPr>
+            <w:tcW w:w="4893" w:type="dxa"/>
+          </w:tcPr>
+          <w:p>
+            <w:pPr>
+              <w:pBdr>
+                <w:top w:val="nil"/>
+                <w:left w:val="nil"/>
+                <w:bottom w:val="nil"/>
+                <w:right w:val="nil"/>
+                <w:between w:val="nil"/>
+              </w:pBdr>
+              <w:ind w:left="92"/>
+              <w:jc w:val="both"/>
+              <w:rPr>
+                <w:rFonts w:ascii="Times New Roman" w:eastAsia="Times New Roman" w:hAnsi="Times New Roman" w:cs="Times New Roman"/>
+                <w:b/>
+                <w:bCs/>
+                <w:color w:val="000000"/>
+                <w:sz w:val="21"/>
+                <w:szCs w:val="21"/>
+                <w:highlight w:val="yellow"/>
+              </w:rPr>
+            </w:pPr>
+            <w:r>
+              <w:rPr>
+                <w:rFonts w:ascii="Times New Roman" w:eastAsia="Times New Roman" w:hAnsi="Times New Roman" w:cs="Times New Roman"/>
+                <w:b/>
+                <w:bCs/>
+                <w:color w:val="000000"/>
+                <w:sz w:val="21"/>
+                <w:szCs w:val="21"/>
+              </w:rPr>
+              <w:t>26B96372</w:t>
+            </w:r>
+          </w:p>
+        </w:tc>
+      </w:tr>
+      <w:tr>
+        <w:trPr>
+          <w:trHeight w:val="350"/>
+        </w:trPr>
+        <w:tc>
+          <w:tcPr>
+            <w:tcW w:w="4321" w:type="dxa"/>
+          </w:tcPr>
+          <w:p>
+            <w:pPr>
+              <w:pBdr>
+                <w:top w:val="nil"/>
+                <w:left w:val="nil"/>
+                <w:bottom w:val="nil"/>
+                <w:right w:val="nil"/>
+                <w:between w:val="nil"/>
+              </w:pBdr>
+              <w:ind w:left="93"/>
+              <w:rPr>
+                <w:rFonts w:ascii="Times New Roman" w:eastAsia="Times New Roman" w:hAnsi="Times New Roman" w:cs="Times New Roman"/>
+                <w:color w:val="000000"/>
+                <w:sz w:val="21"/>
+                <w:szCs w:val="21"/>
+              </w:rPr>
+            </w:pPr>
+            <w:proofErr w:type="spellStart"/>
+            <w:r>
+              <w:rPr>
+                <w:rFonts w:ascii="Times New Roman" w:eastAsia="Times New Roman" w:hAnsi="Times New Roman" w:cs="Times New Roman"/>
+                <w:color w:val="000000"/>
+                <w:sz w:val="21"/>
+                <w:szCs w:val="21"/>
+              </w:rPr>
+              <w:t>Kivitelező</w:t>
+            </w:r>
+            <w:proofErr w:type="spellEnd"/>
+            <w:r>
+              <w:rPr>
+                <w:rFonts w:ascii="Times New Roman" w:eastAsia="Times New Roman" w:hAnsi="Times New Roman" w:cs="Times New Roman"/>
+                <w:color w:val="000000"/>
+                <w:sz w:val="21"/>
+                <w:szCs w:val="21"/>
+              </w:rPr>
+              <w:t xml:space="preserve"> </w:t>
+            </w:r>
+            <w:proofErr w:type="spellStart"/>
+            <w:r>
+              <w:rPr>
+                <w:rFonts w:ascii="Times New Roman" w:eastAsia="Times New Roman" w:hAnsi="Times New Roman" w:cs="Times New Roman"/>
+                <w:color w:val="000000"/>
+                <w:sz w:val="21"/>
+                <w:szCs w:val="21"/>
+              </w:rPr>
+              <w:t>építési</w:t>
+            </w:r>
+            <w:proofErr w:type="spellEnd"/>
+            <w:r>
+              <w:rPr>
+                <w:rFonts w:ascii="Times New Roman" w:eastAsia="Times New Roman" w:hAnsi="Times New Roman" w:cs="Times New Roman"/>
+                <w:color w:val="000000"/>
+                <w:sz w:val="21"/>
+                <w:szCs w:val="21"/>
+              </w:rPr>
+              <w:t xml:space="preserve"> </w:t>
+            </w:r>
+            <w:proofErr w:type="spellStart"/>
+            <w:r>
+              <w:rPr>
+                <w:rFonts w:ascii="Times New Roman" w:eastAsia="Times New Roman" w:hAnsi="Times New Roman" w:cs="Times New Roman"/>
+                <w:color w:val="000000"/>
+                <w:sz w:val="21"/>
+                <w:szCs w:val="21"/>
+              </w:rPr>
+              <w:t>szerelési</w:t>
+            </w:r>
+            <w:proofErr w:type="spellEnd"/>
+            <w:r>
+              <w:rPr>
+                <w:rFonts w:ascii="Times New Roman" w:eastAsia="Times New Roman" w:hAnsi="Times New Roman" w:cs="Times New Roman"/>
+                <w:color w:val="000000"/>
+                <w:sz w:val="21"/>
+                <w:szCs w:val="21"/>
+              </w:rPr>
+              <w:t xml:space="preserve"> </w:t>
+            </w:r>
+            <w:proofErr w:type="spellStart"/>
+            <w:r>
+              <w:rPr>
+                <w:rFonts w:ascii="Times New Roman" w:eastAsia="Times New Roman" w:hAnsi="Times New Roman" w:cs="Times New Roman"/>
+                <w:color w:val="000000"/>
+                <w:sz w:val="21"/>
+                <w:szCs w:val="21"/>
+              </w:rPr>
+              <w:t>biztosításának</w:t>
+            </w:r>
+            <w:proofErr w:type="spellEnd"/>
+            <w:r>
+              <w:rPr>
+                <w:rFonts w:ascii="Times New Roman" w:eastAsia="Times New Roman" w:hAnsi="Times New Roman" w:cs="Times New Roman"/>
+                <w:color w:val="000000"/>
+                <w:sz w:val="21"/>
+                <w:szCs w:val="21"/>
+              </w:rPr>
+              <w:t xml:space="preserve"> </w:t>
+            </w:r>
+            <w:proofErr w:type="spellStart"/>
+            <w:r>
+              <w:rPr>
+                <w:rFonts w:ascii="Times New Roman" w:eastAsia="Times New Roman" w:hAnsi="Times New Roman" w:cs="Times New Roman"/>
+                <w:color w:val="000000"/>
+                <w:sz w:val="21"/>
+                <w:szCs w:val="21"/>
+              </w:rPr>
+              <w:t>kötvényszáma</w:t>
+            </w:r>
+            <w:proofErr w:type="spellEnd"/>
+            <w:r>
+              <w:rPr>
+                <w:rFonts w:ascii="Times New Roman" w:eastAsia="Times New Roman" w:hAnsi="Times New Roman" w:cs="Times New Roman"/>
+                <w:color w:val="000000"/>
+                <w:sz w:val="21"/>
+                <w:szCs w:val="21"/>
+              </w:rPr>
+              <w:t xml:space="preserve"> </w:t>
+            </w:r>
+            <w:proofErr w:type="spellStart"/>
+            <w:r>
+              <w:rPr>
+                <w:rFonts w:ascii="Times New Roman" w:eastAsia="Times New Roman" w:hAnsi="Times New Roman" w:cs="Times New Roman"/>
+                <w:color w:val="000000"/>
+                <w:sz w:val="21"/>
+                <w:szCs w:val="21"/>
+              </w:rPr>
+              <w:t>és</w:t>
+            </w:r>
+            <w:proofErr w:type="spellEnd"/>
+            <w:r>
+              <w:rPr>
+                <w:rFonts w:ascii="Times New Roman" w:eastAsia="Times New Roman" w:hAnsi="Times New Roman" w:cs="Times New Roman"/>
+                <w:color w:val="000000"/>
+                <w:sz w:val="21"/>
+                <w:szCs w:val="21"/>
+              </w:rPr>
+              <w:t xml:space="preserve"> </w:t>
+            </w:r>
+            <w:proofErr w:type="spellStart"/>
+            <w:r>
+              <w:rPr>
+                <w:rFonts w:ascii="Times New Roman" w:eastAsia="Times New Roman" w:hAnsi="Times New Roman" w:cs="Times New Roman"/>
+                <w:color w:val="000000"/>
+                <w:sz w:val="21"/>
+                <w:szCs w:val="21"/>
+              </w:rPr>
+              <w:t>érvényessége</w:t>
+            </w:r>
+            <w:proofErr w:type="spellEnd"/>
+            <w:r>
+              <w:rPr>
+                <w:rFonts w:ascii="Times New Roman" w:eastAsia="Times New Roman" w:hAnsi="Times New Roman" w:cs="Times New Roman"/>
+                <w:color w:val="000000"/>
+                <w:sz w:val="21"/>
+                <w:szCs w:val="21"/>
+              </w:rPr>
+              <w:t>:</w:t>
+            </w:r>
+          </w:p>
+        </w:tc>
+        <w:tc>
+          <w:tcPr>
+            <w:tcW w:w="4893" w:type="dxa"/>
+          </w:tcPr>
+          <w:p>
+            <w:pPr>
+              <w:pBdr>
+                <w:top w:val="nil"/>
+                <w:left w:val="nil"/>
+                <w:bottom w:val="nil"/>
+                <w:right w:val="nil"/>
+                <w:between w:val="nil"/>
+              </w:pBdr>
+              <w:ind w:left="92"/>
+              <w:jc w:val="both"/>
+              <w:rPr>
+                <w:rFonts w:ascii="Times New Roman" w:eastAsia="Times New Roman" w:hAnsi="Times New Roman" w:cs="Times New Roman"/>
+                <w:b/>
+                <w:bCs/>
+                <w:color w:val="000000"/>
+                <w:sz w:val="21"/>
+                <w:szCs w:val="21"/>
+              </w:rPr>
+            </w:pPr>
+            <w:r>
+              <w:rPr>
+                <w:rFonts w:ascii="Times New Roman" w:eastAsia="Times New Roman" w:hAnsi="Times New Roman" w:cs="Times New Roman"/>
+                <w:b/>
+                <w:bCs/>
+                <w:color w:val="000000"/>
+                <w:sz w:val="21"/>
+                <w:szCs w:val="21"/>
+              </w:rPr>
+              <w:t>95595005769188500</w:t>
+            </w:r>
+          </w:p>
+        </w:tc>
+      </w:tr>
+      <w:tr>
+        <w:trPr>
+          <w:trHeight w:val="274"/>
+        </w:trPr>
+        <w:tc>
+          <w:tcPr>
+            <w:tcW w:w="4321" w:type="dxa"/>
+            <w:hideMark/>
+          </w:tcPr>
+          <w:p>
+            <w:pPr>
+              <w:pBdr>
+                <w:top w:val="nil"/>
+                <w:left w:val="nil"/>
+                <w:bottom w:val="nil"/>
+                <w:right w:val="nil"/>
+                <w:between w:val="nil"/>
+              </w:pBdr>
+              <w:ind w:left="91"/>
+              <w:jc w:val="both"/>
+              <w:rPr>
+                <w:rFonts w:ascii="Times New Roman" w:eastAsia="Times New Roman" w:hAnsi="Times New Roman" w:cs="Times New Roman"/>
+                <w:i/>
+                <w:iCs/>
+                <w:color w:val="000000"/>
+                <w:sz w:val="21"/>
+                <w:szCs w:val="21"/>
+              </w:rPr>
+            </w:pPr>
+            <w:proofErr w:type="spellStart"/>
+            <w:r>
+              <w:rPr>
+                <w:rFonts w:ascii="Times New Roman" w:eastAsia="Times New Roman" w:hAnsi="Times New Roman" w:cs="Times New Roman"/>
+                <w:color w:val="000000"/>
+                <w:sz w:val="21"/>
+                <w:szCs w:val="21"/>
+              </w:rPr>
+              <w:t>Képviseli</w:t>
+            </w:r>
+            <w:proofErr w:type="spellEnd"/>
+            <w:r>
+              <w:rPr>
+                <w:rFonts w:ascii="Times New Roman" w:eastAsia="Times New Roman" w:hAnsi="Times New Roman" w:cs="Times New Roman"/>
+                <w:color w:val="000000"/>
+                <w:sz w:val="21"/>
+                <w:szCs w:val="21"/>
+              </w:rPr>
+              <w:t xml:space="preserve">: </w:t>
+            </w:r>
+          </w:p>
+        </w:tc>
+        <w:tc>
+          <w:tcPr>
+            <w:tcW w:w="4893" w:type="dxa"/>
+          </w:tcPr>
+          <w:p>
+            <w:pPr>
+              <w:pBdr>
+                <w:top w:val="nil"/>
+                <w:left w:val="nil"/>
+                <w:bottom w:val="nil"/>
+                <w:right w:val="nil"/>
+                <w:between w:val="nil"/>
+              </w:pBdr>
+              <w:ind w:left="86" w:firstLine="4"/>
+              <w:jc w:val="both"/>
+              <w:rPr>
+                <w:rFonts w:ascii="Times New Roman" w:eastAsia="Times New Roman" w:hAnsi="Times New Roman" w:cs="Times New Roman"/>
+                <w:b/>
+                <w:bCs/>
+                <w:color w:val="000000"/>
+                <w:sz w:val="21"/>
+                <w:szCs w:val="21"/>
+              </w:rPr>
+            </w:pPr>
+            <w:r>
+              <w:rPr>
+                <w:rFonts w:ascii="Times New Roman" w:eastAsia="Times New Roman" w:hAnsi="Times New Roman" w:cs="Times New Roman"/>
+                <w:b/>
+                <w:bCs/>
+                <w:color w:val="000000"/>
+                <w:sz w:val="21"/>
+                <w:szCs w:val="21"/>
+              </w:rPr>
+              <w:t>Dobai Tamás</w:t>
+            </w:r>
+          </w:p>
+        </w:tc>
+      </w:tr>
+      <w:tr>
+        <w:trPr>
+          <w:trHeight w:val="242"/>
+        </w:trPr>
+        <w:tc>
+          <w:tcPr>
+            <w:tcW w:w="4321" w:type="dxa"/>
+            <w:hideMark/>
           </w:tcPr>
           <w:p>
             <w:pPr>
@@ -1523,11 +1864,14 @@
               <w:jc w:val="both"/>
               <w:rPr>
                 <w:rFonts w:ascii="Times New Roman" w:eastAsia="Times New Roman" w:hAnsi="Times New Roman" w:cs="Times New Roman"/>
+                <w:i/>
+                <w:iCs/>
                 <w:color w:val="000000"/>
                 <w:sz w:val="21"/>
                 <w:szCs w:val="21"/>
               </w:rPr>
             </w:pPr>
+            <w:proofErr w:type="spellStart"/>
             <w:r>
               <w:rPr>
                 <w:rFonts w:ascii="Times New Roman" w:eastAsia="Times New Roman" w:hAnsi="Times New Roman" w:cs="Times New Roman"/>
@@ -1535,9 +1879,9 @@
                 <w:sz w:val="21"/>
                 <w:szCs w:val="21"/>
               </w:rPr>
-              <w:t xml:space="preserve">MKIK </w:t>
-            </w:r>
-            <w:proofErr w:type="spellStart"/>
+              <w:t>Bankszámlát</w:t>
+            </w:r>
+            <w:proofErr w:type="spellEnd"/>
             <w:r>
               <w:rPr>
                 <w:rFonts w:ascii="Times New Roman" w:eastAsia="Times New Roman" w:hAnsi="Times New Roman" w:cs="Times New Roman"/>
@@ -1545,9 +1889,9 @@
                 <w:sz w:val="21"/>
                 <w:szCs w:val="21"/>
               </w:rPr>
-              <w:t>regisztrációs</w:t>
-            </w:r>
-            <w:proofErr w:type="spellEnd"/>
+              <w:t xml:space="preserve"> </w:t>
+            </w:r>
+            <w:proofErr w:type="spellStart"/>
             <w:r>
               <w:rPr>
                 <w:rFonts w:ascii="Times New Roman" w:eastAsia="Times New Roman" w:hAnsi="Times New Roman" w:cs="Times New Roman"/>
@@ -1555,9 +1899,9 @@
                 <w:sz w:val="21"/>
                 <w:szCs w:val="21"/>
               </w:rPr>
-              <w:t xml:space="preserve"> </w:t>
-            </w:r>
-            <w:proofErr w:type="spellStart"/>
+              <w:t>vezető</w:t>
+            </w:r>
+            <w:proofErr w:type="spellEnd"/>
             <w:r>
               <w:rPr>
                 <w:rFonts w:ascii="Times New Roman" w:eastAsia="Times New Roman" w:hAnsi="Times New Roman" w:cs="Times New Roman"/>
@@ -1565,9 +1909,9 @@
                 <w:sz w:val="21"/>
                 <w:szCs w:val="21"/>
               </w:rPr>
-              <w:t>szám</w:t>
-            </w:r>
-            <w:proofErr w:type="spellEnd"/>
+              <w:t xml:space="preserve"> </w:t>
+            </w:r>
+            <w:proofErr w:type="spellStart"/>
             <w:r>
               <w:rPr>
                 <w:rFonts w:ascii="Times New Roman" w:eastAsia="Times New Roman" w:hAnsi="Times New Roman" w:cs="Times New Roman"/>
@@ -1575,19 +1919,23 @@
                 <w:sz w:val="21"/>
                 <w:szCs w:val="21"/>
               </w:rPr>
-              <w:t>:</w:t>
+              <w:t>pénzintézet</w:t>
+            </w:r>
+            <w:proofErr w:type="spellEnd"/>
+            <w:r>
+              <w:rPr>
+                <w:rFonts w:ascii="Times New Roman" w:eastAsia="Times New Roman" w:hAnsi="Times New Roman" w:cs="Times New Roman"/>
+                <w:color w:val="000000"/>
+                <w:sz w:val="21"/>
+                <w:szCs w:val="21"/>
+              </w:rPr>
+              <w:t xml:space="preserve"> neve</w:t>
             </w:r>
           </w:p>
         </w:tc>
         <w:tc>
           <w:tcPr>
             <w:tcW w:w="4893" w:type="dxa"/>
-            <w:tcBorders>
-              <w:top w:val="single" w:sz="6" w:space="0" w:color="000000"/>
-              <w:left w:val="single" w:sz="6" w:space="0" w:color="000000"/>
-              <w:bottom w:val="single" w:sz="6" w:space="0" w:color="000000"/>
-              <w:right w:val="single" w:sz="6" w:space="0" w:color="000000"/>
-            </w:tcBorders>
           </w:tcPr>
           <w:p>
             <w:pPr>
@@ -1598,7 +1946,7 @@
                 <w:right w:val="nil"/>
                 <w:between w:val="nil"/>
               </w:pBdr>
-              <w:ind w:left="92"/>
+              <w:ind w:left="78"/>
               <w:jc w:val="both"/>
               <w:rPr>
                 <w:rFonts w:ascii="Times New Roman" w:eastAsia="Times New Roman" w:hAnsi="Times New Roman" w:cs="Times New Roman"/>
@@ -1607,7 +1955,6 @@
                 <w:color w:val="000000"/>
                 <w:sz w:val="21"/>
                 <w:szCs w:val="21"/>
-                <w:highlight w:val="yellow"/>
               </w:rPr>
             </w:pPr>
             <w:r>
@@ -1619,24 +1966,18 @@
                 <w:sz w:val="21"/>
                 <w:szCs w:val="21"/>
               </w:rPr>
-              <w:t>26B96372</w:t>
+              <w:t>OTP Bank NYRT</w:t>
             </w:r>
           </w:p>
         </w:tc>
       </w:tr>
       <w:tr>
         <w:trPr>
-          <w:trHeight w:val="350"/>
+          <w:trHeight w:val="242"/>
         </w:trPr>
         <w:tc>
           <w:tcPr>
             <w:tcW w:w="4321" w:type="dxa"/>
-            <w:tcBorders>
-              <w:top w:val="single" w:sz="6" w:space="0" w:color="000000"/>
-              <w:left w:val="single" w:sz="6" w:space="0" w:color="000000"/>
-              <w:bottom w:val="single" w:sz="6" w:space="0" w:color="000000"/>
-              <w:right w:val="single" w:sz="6" w:space="0" w:color="000000"/>
-            </w:tcBorders>
           </w:tcPr>
           <w:p>
             <w:pPr>
@@ -1664,127 +2005,7 @@
                 <w:sz w:val="21"/>
                 <w:szCs w:val="21"/>
               </w:rPr>
-              <w:t>Kivitelező</w:t>
-            </w:r>
-            <w:proofErr w:type="spellEnd"/>
-            <w:r>
-              <w:rPr>
-                <w:rFonts w:ascii="Times New Roman" w:eastAsia="Times New Roman" w:hAnsi="Times New Roman" w:cs="Times New Roman"/>
-                <w:color w:val="000000"/>
-                <w:sz w:val="21"/>
-                <w:szCs w:val="21"/>
-              </w:rPr>
-              <w:t xml:space="preserve"> </w:t>
-            </w:r>
-            <w:proofErr w:type="spellStart"/>
-            <w:r>
-              <w:rPr>
-                <w:rFonts w:ascii="Times New Roman" w:eastAsia="Times New Roman" w:hAnsi="Times New Roman" w:cs="Times New Roman"/>
-                <w:color w:val="000000"/>
-                <w:sz w:val="21"/>
-                <w:szCs w:val="21"/>
-              </w:rPr>
-              <w:t>építési</w:t>
-            </w:r>
-            <w:proofErr w:type="spellEnd"/>
-            <w:r>
-              <w:rPr>
-                <w:rFonts w:ascii="Times New Roman" w:eastAsia="Times New Roman" w:hAnsi="Times New Roman" w:cs="Times New Roman"/>
-                <w:color w:val="000000"/>
-                <w:sz w:val="21"/>
-                <w:szCs w:val="21"/>
-              </w:rPr>
-              <w:t xml:space="preserve"> </w:t>
-            </w:r>
-            <w:proofErr w:type="spellStart"/>
-            <w:r>
-              <w:rPr>
-                <w:rFonts w:ascii="Times New Roman" w:eastAsia="Times New Roman" w:hAnsi="Times New Roman" w:cs="Times New Roman"/>
-                <w:color w:val="000000"/>
-                <w:sz w:val="21"/>
-                <w:szCs w:val="21"/>
-              </w:rPr>
-              <w:t>szerelési</w:t>
-            </w:r>
-            <w:proofErr w:type="spellEnd"/>
-            <w:r>
-              <w:rPr>
-                <w:rFonts w:ascii="Times New Roman" w:eastAsia="Times New Roman" w:hAnsi="Times New Roman" w:cs="Times New Roman"/>
-                <w:color w:val="000000"/>
-                <w:sz w:val="21"/>
-                <w:szCs w:val="21"/>
-              </w:rPr>
-              <w:t xml:space="preserve"> </w:t>
-            </w:r>
-            <w:proofErr w:type="spellStart"/>
-            <w:r>
-              <w:rPr>
-                <w:rFonts w:ascii="Times New Roman" w:eastAsia="Times New Roman" w:hAnsi="Times New Roman" w:cs="Times New Roman"/>
-                <w:color w:val="000000"/>
-                <w:sz w:val="21"/>
-                <w:szCs w:val="21"/>
-              </w:rPr>
-              <w:t>biztosításának</w:t>
-            </w:r>
-            <w:proofErr w:type="spellEnd"/>
-            <w:r>
-              <w:rPr>
-                <w:rFonts w:ascii="Times New Roman" w:eastAsia="Times New Roman" w:hAnsi="Times New Roman" w:cs="Times New Roman"/>
-                <w:color w:val="000000"/>
-                <w:sz w:val="21"/>
-                <w:szCs w:val="21"/>
-              </w:rPr>
-              <w:t xml:space="preserve"> </w:t>
-            </w:r>
-            <w:proofErr w:type="spellStart"/>
-            <w:r>
-              <w:rPr>
-                <w:rFonts w:ascii="Times New Roman" w:eastAsia="Times New Roman" w:hAnsi="Times New Roman" w:cs="Times New Roman"/>
-                <w:color w:val="000000"/>
-                <w:sz w:val="21"/>
-                <w:szCs w:val="21"/>
-              </w:rPr>
-              <w:t>kötvényszáma</w:t>
-            </w:r>
-            <w:proofErr w:type="spellEnd"/>
-            <w:r>
-              <w:rPr>
-                <w:rFonts w:ascii="Times New Roman" w:eastAsia="Times New Roman" w:hAnsi="Times New Roman" w:cs="Times New Roman"/>
-                <w:color w:val="000000"/>
-                <w:sz w:val="21"/>
-                <w:szCs w:val="21"/>
-              </w:rPr>
-              <w:t xml:space="preserve"> </w:t>
-            </w:r>
-            <w:proofErr w:type="spellStart"/>
-            <w:r>
-              <w:rPr>
-                <w:rFonts w:ascii="Times New Roman" w:eastAsia="Times New Roman" w:hAnsi="Times New Roman" w:cs="Times New Roman"/>
-                <w:color w:val="000000"/>
-                <w:sz w:val="21"/>
-                <w:szCs w:val="21"/>
-              </w:rPr>
-              <w:t>és</w:t>
-            </w:r>
-            <w:proofErr w:type="spellEnd"/>
-            <w:r>
-              <w:rPr>
-                <w:rFonts w:ascii="Times New Roman" w:eastAsia="Times New Roman" w:hAnsi="Times New Roman" w:cs="Times New Roman"/>
-                <w:color w:val="000000"/>
-                <w:sz w:val="21"/>
-                <w:szCs w:val="21"/>
-              </w:rPr>
-              <w:t xml:space="preserve"> </w:t>
-            </w:r>
-            <w:proofErr w:type="spellStart"/>
-            <w:r>
-              <w:rPr>
-                <w:rFonts w:ascii="Times New Roman" w:eastAsia="Times New Roman" w:hAnsi="Times New Roman" w:cs="Times New Roman"/>
-                <w:color w:val="000000"/>
-                <w:sz w:val="21"/>
-                <w:szCs w:val="21"/>
-              </w:rPr>
-              <w:t>érvényessége</w:t>
+              <w:t>Bankszámlaszám</w:t>
             </w:r>
             <w:proofErr w:type="spellEnd"/>
             <w:r>
@@ -1801,350 +2022,6 @@
         <w:tc>
           <w:tcPr>
             <w:tcW w:w="4893" w:type="dxa"/>
-            <w:tcBorders>
-              <w:top w:val="single" w:sz="6" w:space="0" w:color="000000"/>
-              <w:left w:val="single" w:sz="6" w:space="0" w:color="000000"/>
-              <w:bottom w:val="single" w:sz="6" w:space="0" w:color="000000"/>
-              <w:right w:val="single" w:sz="6" w:space="0" w:color="000000"/>
-            </w:tcBorders>
-          </w:tcPr>
-          <w:p>
-            <w:pPr>
-              <w:pBdr>
-                <w:top w:val="nil"/>
-                <w:left w:val="nil"/>
-                <w:bottom w:val="nil"/>
-                <w:right w:val="nil"/>
-                <w:between w:val="nil"/>
-              </w:pBdr>
-              <w:ind w:left="92"/>
-              <w:jc w:val="both"/>
-              <w:rPr>
-                <w:rFonts w:ascii="Times New Roman" w:eastAsia="Times New Roman" w:hAnsi="Times New Roman" w:cs="Times New Roman"/>
-                <w:b/>
-                <w:bCs/>
-                <w:color w:val="000000"/>
-                <w:sz w:val="21"/>
-                <w:szCs w:val="21"/>
-              </w:rPr>
-            </w:pPr>
-            <w:r>
-              <w:rPr>
-                <w:rFonts w:ascii="Times New Roman" w:eastAsia="Times New Roman" w:hAnsi="Times New Roman" w:cs="Times New Roman"/>
-                <w:b/>
-                <w:bCs/>
-                <w:color w:val="000000"/>
-                <w:sz w:val="21"/>
-                <w:szCs w:val="21"/>
-              </w:rPr>
-              <w:t>95595005769188500</w:t>
-            </w:r>
-          </w:p>
-        </w:tc>
-      </w:tr>
-      <w:tr>
-        <w:trPr>
-          <w:trHeight w:val="274"/>
-        </w:trPr>
-        <w:tc>
-          <w:tcPr>
-            <w:tcW w:w="4321" w:type="dxa"/>
-            <w:tcBorders>
-              <w:top w:val="single" w:sz="6" w:space="0" w:color="000000"/>
-              <w:left w:val="single" w:sz="6" w:space="0" w:color="000000"/>
-              <w:bottom w:val="single" w:sz="6" w:space="0" w:color="000000"/>
-              <w:right w:val="single" w:sz="6" w:space="0" w:color="000000"/>
-            </w:tcBorders>
-          </w:tcPr>
-          <w:p>
-            <w:pPr>
-              <w:pBdr>
-                <w:top w:val="nil"/>
-                <w:left w:val="nil"/>
-                <w:bottom w:val="nil"/>
-                <w:right w:val="nil"/>
-                <w:between w:val="nil"/>
-              </w:pBdr>
-              <w:ind w:left="91"/>
-              <w:jc w:val="both"/>
-              <w:rPr>
-                <w:rFonts w:ascii="Times New Roman" w:eastAsia="Times New Roman" w:hAnsi="Times New Roman" w:cs="Times New Roman"/>
-                <w:i/>
-                <w:iCs/>
-                <w:color w:val="000000"/>
-                <w:sz w:val="21"/>
-                <w:szCs w:val="21"/>
-              </w:rPr>
-            </w:pPr>
-            <w:proofErr w:type="spellStart"/>
-            <w:r>
-              <w:rPr>
-                <w:rFonts w:ascii="Times New Roman" w:eastAsia="Times New Roman" w:hAnsi="Times New Roman" w:cs="Times New Roman"/>
-                <w:color w:val="000000"/>
-                <w:sz w:val="21"/>
-                <w:szCs w:val="21"/>
-              </w:rPr>
-              <w:t>Képviseli</w:t>
-            </w:r>
-            <w:proofErr w:type="spellEnd"/>
-            <w:r>
-              <w:rPr>
-                <w:rFonts w:ascii="Times New Roman" w:eastAsia="Times New Roman" w:hAnsi="Times New Roman" w:cs="Times New Roman"/>
-                <w:color w:val="000000"/>
-                <w:sz w:val="21"/>
-                <w:szCs w:val="21"/>
-              </w:rPr>
-              <w:t xml:space="preserve">: </w:t>
-            </w:r>
-          </w:p>
-        </w:tc>
-        <w:tc>
-          <w:tcPr>
-            <w:tcW w:w="4893" w:type="dxa"/>
-            <w:tcBorders>
-              <w:top w:val="single" w:sz="6" w:space="0" w:color="000000"/>
-              <w:left w:val="single" w:sz="6" w:space="0" w:color="000000"/>
-              <w:bottom w:val="single" w:sz="6" w:space="0" w:color="000000"/>
-              <w:right w:val="single" w:sz="6" w:space="0" w:color="000000"/>
-            </w:tcBorders>
-          </w:tcPr>
-          <w:p>
-            <w:pPr>
-              <w:pBdr>
-                <w:top w:val="nil"/>
-                <w:left w:val="nil"/>
-                <w:bottom w:val="nil"/>
-                <w:right w:val="nil"/>
-                <w:between w:val="nil"/>
-              </w:pBdr>
-              <w:ind w:left="86" w:firstLine="4"/>
-              <w:jc w:val="both"/>
-              <w:rPr>
-                <w:rFonts w:ascii="Times New Roman" w:eastAsia="Times New Roman" w:hAnsi="Times New Roman" w:cs="Times New Roman"/>
-                <w:b/>
-                <w:bCs/>
-                <w:color w:val="000000"/>
-                <w:sz w:val="21"/>
-                <w:szCs w:val="21"/>
-              </w:rPr>
-            </w:pPr>
-            <w:r>
-              <w:rPr>
-                <w:rFonts w:ascii="Times New Roman" w:eastAsia="Times New Roman" w:hAnsi="Times New Roman" w:cs="Times New Roman"/>
-                <w:b/>
-                <w:bCs/>
-                <w:color w:val="000000"/>
-                <w:sz w:val="21"/>
-                <w:szCs w:val="21"/>
-              </w:rPr>
-              <w:t>Dobai Tamás</w:t>
-            </w:r>
-          </w:p>
-        </w:tc>
-      </w:tr>
-      <w:tr>
-        <w:trPr>
-          <w:trHeight w:val="242"/>
-        </w:trPr>
-        <w:tc>
-          <w:tcPr>
-            <w:tcW w:w="4321" w:type="dxa"/>
-            <w:tcBorders>
-              <w:top w:val="single" w:sz="6" w:space="0" w:color="000000"/>
-              <w:left w:val="single" w:sz="6" w:space="0" w:color="000000"/>
-              <w:bottom w:val="single" w:sz="6" w:space="0" w:color="000000"/>
-              <w:right w:val="single" w:sz="6" w:space="0" w:color="000000"/>
-            </w:tcBorders>
-          </w:tcPr>
-          <w:p>
-            <w:pPr>
-              <w:pBdr>
-                <w:top w:val="nil"/>
-                <w:left w:val="nil"/>
-                <w:bottom w:val="nil"/>
-                <w:right w:val="nil"/>
-                <w:between w:val="nil"/>
-              </w:pBdr>
-              <w:ind w:left="93"/>
-              <w:jc w:val="both"/>
-              <w:rPr>
-                <w:rFonts w:ascii="Times New Roman" w:eastAsia="Times New Roman" w:hAnsi="Times New Roman" w:cs="Times New Roman"/>
-                <w:i/>
-                <w:iCs/>
-                <w:color w:val="000000"/>
-                <w:sz w:val="21"/>
-                <w:szCs w:val="21"/>
-              </w:rPr>
-            </w:pPr>
-            <w:proofErr w:type="spellStart"/>
-            <w:r>
-              <w:rPr>
-                <w:rFonts w:ascii="Times New Roman" w:eastAsia="Times New Roman" w:hAnsi="Times New Roman" w:cs="Times New Roman"/>
-                <w:color w:val="000000"/>
-                <w:sz w:val="21"/>
-                <w:szCs w:val="21"/>
-              </w:rPr>
-              <w:t>Bankszámlát</w:t>
-            </w:r>
-            <w:proofErr w:type="spellEnd"/>
-            <w:r>
-              <w:rPr>
-                <w:rFonts w:ascii="Times New Roman" w:eastAsia="Times New Roman" w:hAnsi="Times New Roman" w:cs="Times New Roman"/>
-                <w:color w:val="000000"/>
-                <w:sz w:val="21"/>
-                <w:szCs w:val="21"/>
-              </w:rPr>
-              <w:t xml:space="preserve"> </w:t>
-            </w:r>
-            <w:proofErr w:type="spellStart"/>
-            <w:r>
-              <w:rPr>
-                <w:rFonts w:ascii="Times New Roman" w:eastAsia="Times New Roman" w:hAnsi="Times New Roman" w:cs="Times New Roman"/>
-                <w:color w:val="000000"/>
-                <w:sz w:val="21"/>
-                <w:szCs w:val="21"/>
-              </w:rPr>
-              <w:t>vezető</w:t>
-            </w:r>
-            <w:proofErr w:type="spellEnd"/>
-            <w:r>
-              <w:rPr>
-                <w:rFonts w:ascii="Times New Roman" w:eastAsia="Times New Roman" w:hAnsi="Times New Roman" w:cs="Times New Roman"/>
-                <w:color w:val="000000"/>
-                <w:sz w:val="21"/>
-                <w:szCs w:val="21"/>
-              </w:rPr>
-              <w:t xml:space="preserve"> </w:t>
-            </w:r>
-            <w:proofErr w:type="spellStart"/>
-            <w:r>
-              <w:rPr>
-                <w:rFonts w:ascii="Times New Roman" w:eastAsia="Times New Roman" w:hAnsi="Times New Roman" w:cs="Times New Roman"/>
-                <w:color w:val="000000"/>
-                <w:sz w:val="21"/>
-                <w:szCs w:val="21"/>
-              </w:rPr>
-              <w:t>pénzintézet</w:t>
-            </w:r>
-            <w:proofErr w:type="spellEnd"/>
-            <w:r>
-              <w:rPr>
-                <w:rFonts w:ascii="Times New Roman" w:eastAsia="Times New Roman" w:hAnsi="Times New Roman" w:cs="Times New Roman"/>
-                <w:color w:val="000000"/>
-                <w:sz w:val="21"/>
-                <w:szCs w:val="21"/>
-              </w:rPr>
-              <w:t xml:space="preserve"> neve</w:t>
-            </w:r>
-          </w:p>
-        </w:tc>
-        <w:tc>
-          <w:tcPr>
-            <w:tcW w:w="4893" w:type="dxa"/>
-            <w:tcBorders>
-              <w:top w:val="single" w:sz="6" w:space="0" w:color="000000"/>
-              <w:left w:val="single" w:sz="6" w:space="0" w:color="000000"/>
-              <w:bottom w:val="single" w:sz="6" w:space="0" w:color="000000"/>
-              <w:right w:val="single" w:sz="6" w:space="0" w:color="000000"/>
-            </w:tcBorders>
-          </w:tcPr>
-          <w:p>
-            <w:pPr>
-              <w:pBdr>
-                <w:top w:val="nil"/>
-                <w:left w:val="nil"/>
-                <w:bottom w:val="nil"/>
-                <w:right w:val="nil"/>
-                <w:between w:val="nil"/>
-              </w:pBdr>
-              <w:ind w:left="78"/>
-              <w:jc w:val="both"/>
-              <w:rPr>
-                <w:rFonts w:ascii="Times New Roman" w:eastAsia="Times New Roman" w:hAnsi="Times New Roman" w:cs="Times New Roman"/>
-                <w:b/>
-                <w:bCs/>
-                <w:color w:val="000000"/>
-                <w:sz w:val="21"/>
-                <w:szCs w:val="21"/>
-              </w:rPr>
-            </w:pPr>
-            <w:r>
-              <w:rPr>
-                <w:rFonts w:ascii="Times New Roman" w:eastAsia="Times New Roman" w:hAnsi="Times New Roman" w:cs="Times New Roman"/>
-                <w:b/>
-                <w:bCs/>
-                <w:color w:val="000000"/>
-                <w:sz w:val="21"/>
-                <w:szCs w:val="21"/>
-              </w:rPr>
-              <w:t>OTP Bank NYRT</w:t>
-            </w:r>
-          </w:p>
-        </w:tc>
-      </w:tr>
-      <w:tr>
-        <w:trPr>
-          <w:trHeight w:val="242"/>
-        </w:trPr>
-        <w:tc>
-          <w:tcPr>
-            <w:tcW w:w="4321" w:type="dxa"/>
-            <w:tcBorders>
-              <w:top w:val="single" w:sz="6" w:space="0" w:color="000000"/>
-              <w:left w:val="single" w:sz="6" w:space="0" w:color="000000"/>
-              <w:bottom w:val="single" w:sz="6" w:space="0" w:color="000000"/>
-              <w:right w:val="single" w:sz="6" w:space="0" w:color="000000"/>
-            </w:tcBorders>
-          </w:tcPr>
-          <w:p>
-            <w:pPr>
-              <w:pBdr>
-                <w:top w:val="nil"/>
-                <w:left w:val="nil"/>
-                <w:bottom w:val="nil"/>
-                <w:right w:val="nil"/>
-                <w:between w:val="nil"/>
-              </w:pBdr>
-              <w:ind w:left="93"/>
-              <w:jc w:val="both"/>
-              <w:rPr>
-                <w:rFonts w:ascii="Times New Roman" w:eastAsia="Times New Roman" w:hAnsi="Times New Roman" w:cs="Times New Roman"/>
-                <w:color w:val="000000"/>
-                <w:sz w:val="21"/>
-                <w:szCs w:val="21"/>
-              </w:rPr>
-            </w:pPr>
-            <w:proofErr w:type="spellStart"/>
-            <w:r>
-              <w:rPr>
-                <w:rFonts w:ascii="Times New Roman" w:eastAsia="Times New Roman" w:hAnsi="Times New Roman" w:cs="Times New Roman"/>
-                <w:color w:val="000000"/>
-                <w:sz w:val="21"/>
-                <w:szCs w:val="21"/>
-              </w:rPr>
-              <w:t>Bankszámlaszám</w:t>
-            </w:r>
-            <w:proofErr w:type="spellEnd"/>
-            <w:r>
-              <w:rPr>
-                <w:rFonts w:ascii="Times New Roman" w:eastAsia="Times New Roman" w:hAnsi="Times New Roman" w:cs="Times New Roman"/>
-                <w:color w:val="000000"/>
-                <w:sz w:val="21"/>
-                <w:szCs w:val="21"/>
-              </w:rPr>
-              <w:t>:</w:t>
-            </w:r>
-          </w:p>
-        </w:tc>
-        <w:tc>
-          <w:tcPr>
-            <w:tcW w:w="4893" w:type="dxa"/>
-            <w:tcBorders>
-              <w:top w:val="single" w:sz="6" w:space="0" w:color="000000"/>
-              <w:left w:val="single" w:sz="6" w:space="0" w:color="000000"/>
-              <w:bottom w:val="single" w:sz="6" w:space="0" w:color="000000"/>
-              <w:right w:val="single" w:sz="6" w:space="0" w:color="000000"/>
-            </w:tcBorders>
           </w:tcPr>
           <w:p>
             <w:pPr>
@@ -2459,6 +2336,7 @@
           <w:szCs w:val="21"/>
         </w:rPr>
       </w:pPr>
+      <w:proofErr w:type="gramStart"/>
       <w:r>
         <w:rPr>
           <w:sz w:val="21"/>
@@ -2472,7 +2350,16 @@
           <w:sz w:val="21"/>
           <w:szCs w:val="21"/>
         </w:rPr>
-        <w:t xml:space="preserve">  [ 25 cm vastagságú (R≥ 6,25 m2 K/W) ásványgyapot hőszigetelés beépítése]</w:t>
+        <w:t xml:space="preserve">  [</w:t>
+      </w:r>
+      <w:proofErr w:type="gramEnd"/>
+      <w:r>
+        <w:rPr>
+          <w:color w:val="000000"/>
+          <w:sz w:val="21"/>
+          <w:szCs w:val="21"/>
+        </w:rPr>
+        <w:t xml:space="preserve"> 25 cm vastagságú (R≥ 6,25 m2 K/W) ásványgyapot hőszigetelés beépítése]</w:t>
       </w:r>
     </w:p>
     <w:p>
@@ -2491,6 +2378,7 @@
           <w:szCs w:val="21"/>
         </w:rPr>
       </w:pPr>
+      <w:proofErr w:type="gramStart"/>
       <w:r>
         <w:rPr>
           <w:sz w:val="21"/>
@@ -2504,7 +2392,34 @@
           <w:sz w:val="21"/>
           <w:szCs w:val="21"/>
         </w:rPr>
-        <w:t xml:space="preserve">  [Párafékező fólia (Sd≥20 m)  fólia elhelyezése]</w:t>
+        <w:t xml:space="preserve">  [</w:t>
+      </w:r>
+      <w:proofErr w:type="gramEnd"/>
+      <w:r>
+        <w:rPr>
+          <w:color w:val="000000"/>
+          <w:sz w:val="21"/>
+          <w:szCs w:val="21"/>
+        </w:rPr>
+        <w:t>Párafékező fólia (Sd≥20 m</w:t>
+      </w:r>
+      <w:proofErr w:type="gramStart"/>
+      <w:r>
+        <w:rPr>
+          <w:color w:val="000000"/>
+          <w:sz w:val="21"/>
+          <w:szCs w:val="21"/>
+        </w:rPr>
+        <w:t>)  fólia</w:t>
+      </w:r>
+      <w:proofErr w:type="gramEnd"/>
+      <w:r>
+        <w:rPr>
+          <w:color w:val="000000"/>
+          <w:sz w:val="21"/>
+          <w:szCs w:val="21"/>
+        </w:rPr>
+        <w:t xml:space="preserve"> elhelyezése]</w:t>
       </w:r>
     </w:p>
     <w:p>
@@ -2523,6 +2438,7 @@
           <w:szCs w:val="21"/>
         </w:rPr>
       </w:pPr>
+      <w:proofErr w:type="gramStart"/>
       <w:r>
         <w:rPr>
           <w:sz w:val="21"/>
@@ -2536,7 +2452,16 @@
           <w:sz w:val="21"/>
           <w:szCs w:val="21"/>
         </w:rPr>
-        <w:t xml:space="preserve">  [páraáteresztő por elleni védő fólia (</w:t>
+        <w:t xml:space="preserve">  [</w:t>
+      </w:r>
+      <w:proofErr w:type="gramEnd"/>
+      <w:r>
+        <w:rPr>
+          <w:color w:val="000000"/>
+          <w:sz w:val="21"/>
+          <w:szCs w:val="21"/>
+        </w:rPr>
+        <w:t>páraáteresztő por elleni védő fólia (</w:t>
       </w:r>
       <w:proofErr w:type="spellStart"/>
       <w:r>
@@ -2554,7 +2479,25 @@
           <w:sz w:val="21"/>
           <w:szCs w:val="21"/>
         </w:rPr>
-        <w:t xml:space="preserve"> ≤0,03m )fedéssel történő felhelyezése]</w:t>
+        <w:t xml:space="preserve"> ≤0,03</w:t>
+      </w:r>
+      <w:proofErr w:type="gramStart"/>
+      <w:r>
+        <w:rPr>
+          <w:color w:val="000000"/>
+          <w:sz w:val="21"/>
+          <w:szCs w:val="21"/>
+        </w:rPr>
+        <w:t>m )fedéssel</w:t>
+      </w:r>
+      <w:proofErr w:type="gramEnd"/>
+      <w:r>
+        <w:rPr>
+          <w:color w:val="000000"/>
+          <w:sz w:val="21"/>
+          <w:szCs w:val="21"/>
+        </w:rPr>
+        <w:t xml:space="preserve"> történő felhelyezése]</w:t>
       </w:r>
     </w:p>
     <w:p>
@@ -2573,13 +2516,23 @@
           <w:szCs w:val="21"/>
         </w:rPr>
       </w:pPr>
-      <w:r>
-        <w:rPr>
-          <w:color w:val="000000"/>
-          <w:sz w:val="21"/>
-          <w:szCs w:val="21"/>
-        </w:rPr>
-        <w:t>  [Szükség esetén szerkezet javítása, aljzat előkészítése]</w:t>
+      <w:proofErr w:type="gramStart"/>
+      <w:r>
+        <w:rPr>
+          <w:color w:val="000000"/>
+          <w:sz w:val="21"/>
+          <w:szCs w:val="21"/>
+        </w:rPr>
+        <w:t>  [</w:t>
+      </w:r>
+      <w:proofErr w:type="gramEnd"/>
+      <w:r>
+        <w:rPr>
+          <w:color w:val="000000"/>
+          <w:sz w:val="21"/>
+          <w:szCs w:val="21"/>
+        </w:rPr>
+        <w:t>Szükség esetén szerkezet javítása, aljzat előkészítése]</w:t>
       </w:r>
     </w:p>
     <w:p>
@@ -3427,86 +3380,81 @@
         <w:t xml:space="preserve"> </w:t>
       </w:r>
       <w:r>
+        <w:t>[[</w:t>
+      </w:r>
+      <w:proofErr w:type="spellStart"/>
+      <w:r>
+        <w:t>szamolt</w:t>
+      </w:r>
+      <w:r>
+        <w:t>netto</w:t>
+      </w:r>
+      <w:proofErr w:type="spellEnd"/>
+      <w:r>
+        <w:t>]]</w:t>
+      </w:r>
+      <w:r>
+        <w:t xml:space="preserve"> Ft </w:t>
+      </w:r>
+      <w:r>
+        <w:t>+ ÁFA</w:t>
+      </w:r>
+      <w:r>
+        <w:rPr>
+          <w:sz w:val="21"/>
+          <w:szCs w:val="21"/>
+        </w:rPr>
+        <w:t>,</w:t>
+      </w:r>
+      <w:r>
+        <w:rPr>
+          <w:sz w:val="21"/>
+        </w:rPr>
+        <w:t xml:space="preserve"> azaz </w:t>
+      </w:r>
+      <w:r>
+        <w:t>[[</w:t>
+      </w:r>
+      <w:proofErr w:type="spellStart"/>
+      <w:r>
+        <w:t>szamoltnettoszövegesen</w:t>
+      </w:r>
+      <w:proofErr w:type="spellEnd"/>
+      <w:r>
+        <w:t>]</w:t>
+      </w:r>
+      <w:r>
+        <w:t>] forint + ÁFA</w:t>
+      </w:r>
+      <w:r>
+        <w:rPr>
+          <w:sz w:val="21"/>
+          <w:szCs w:val="21"/>
+        </w:rPr>
+        <w:t xml:space="preserve"> vállalkozói díjban – a továbbiakban: </w:t>
+      </w:r>
+      <w:r>
         <w:rPr>
           <w:b/>
           <w:bCs/>
-          <w:color w:val="000000"/>
-        </w:rPr>
-        <w:t xml:space="preserve"> [[</w:t>
-      </w:r>
-      <w:proofErr w:type="spellStart"/>
-      <w:r>
-        <w:rPr>
-          <w:b/>
-          <w:bCs/>
-          <w:color w:val="000000"/>
-        </w:rPr>
-        <w:t>sz</w:t>
-      </w:r>
-      <w:r>
-        <w:rPr>
-          <w:b/>
-          <w:bCs/>
-        </w:rPr>
-        <w:t>amoltosszeg</w:t>
-      </w:r>
-      <w:proofErr w:type="spellEnd"/>
-      <w:r>
-        <w:rPr>
-          <w:b/>
-          <w:bCs/>
-          <w:color w:val="000000"/>
-        </w:rPr>
-        <w:t>]]</w:t>
-      </w:r>
-      <w:r>
-        <w:rPr>
-          <w:color w:val="000000"/>
-        </w:rPr>
-        <w:t xml:space="preserve"> Ft bruttó</w:t>
-      </w:r>
-      <w:r>
-        <w:t xml:space="preserve">, </w:t>
-      </w:r>
-      <w:r>
-        <w:rPr>
-          <w:color w:val="000000"/>
-          <w:sz w:val="21"/>
-          <w:szCs w:val="21"/>
-        </w:rPr>
-        <w:t xml:space="preserve"> azaz </w:t>
-      </w:r>
-      <w:r>
-        <w:rPr>
-          <w:color w:val="000000"/>
-        </w:rPr>
-        <w:t xml:space="preserve">  </w:t>
-      </w:r>
-      <w:r>
-        <w:rPr>
-          <w:color w:val="000000"/>
-        </w:rPr>
-        <w:t>[[</w:t>
-      </w:r>
-      <w:proofErr w:type="spellStart"/>
-      <w:r>
-        <w:rPr>
-          <w:color w:val="000000"/>
-        </w:rPr>
-        <w:t>szerzodesi_osszeg_betuvel</w:t>
-      </w:r>
-      <w:proofErr w:type="spellEnd"/>
-      <w:r>
-        <w:rPr>
-          <w:color w:val="000000"/>
-        </w:rPr>
-        <w:t>]]</w:t>
-      </w:r>
-      <w:r>
-        <w:rPr>
-          <w:color w:val="000000"/>
-        </w:rPr>
-        <w:t xml:space="preserve">                         </w:t>
+          <w:sz w:val="21"/>
+          <w:szCs w:val="21"/>
+        </w:rPr>
+        <w:t>Vállalkozói díj</w:t>
+      </w:r>
+      <w:r>
+        <w:rPr>
+          <w:sz w:val="21"/>
+          <w:szCs w:val="21"/>
+        </w:rPr>
+        <w:t xml:space="preserve"> – állapodnak meg</w:t>
+      </w:r>
+      <w:r>
+        <w:rPr>
+          <w:sz w:val="21"/>
+          <w:szCs w:val="21"/>
+        </w:rPr>
+        <w:t>, amely az alábbi költségből tevődik össze:</w:t>
       </w:r>
     </w:p>
     <w:p>
@@ -3526,81 +3474,56 @@
     </w:p>
     <w:p>
       <w:pPr>
-        <w:pBdr>
-          <w:top w:val="nil"/>
-          <w:left w:val="nil"/>
-          <w:bottom w:val="nil"/>
-          <w:right w:val="nil"/>
-          <w:between w:val="nil"/>
-        </w:pBdr>
+        <w:numPr>
+          <w:ilvl w:val="0"/>
+          <w:numId w:val="10"/>
+        </w:numPr>
         <w:tabs>
           <w:tab w:val="left" w:pos="0"/>
         </w:tabs>
-        <w:ind w:left="426"/>
         <w:jc w:val="both"/>
         <w:rPr>
-          <w:color w:val="000000"/>
-          <w:sz w:val="21"/>
-          <w:szCs w:val="21"/>
-        </w:rPr>
-      </w:pPr>
-      <w:r>
-        <w:rPr>
-          <w:color w:val="000000"/>
-        </w:rPr>
-        <w:t xml:space="preserve">forint </w:t>
-      </w:r>
-      <w:r>
-        <w:rPr>
-          <w:color w:val="000000"/>
-          <w:sz w:val="21"/>
-          <w:szCs w:val="21"/>
-        </w:rPr>
-        <w:t xml:space="preserve"> vállalkozói díjban – a továbbiakban: </w:t>
-      </w:r>
-      <w:r>
-        <w:rPr>
-          <w:b/>
-          <w:bCs/>
-          <w:color w:val="000000"/>
-          <w:sz w:val="21"/>
-          <w:szCs w:val="21"/>
-        </w:rPr>
-        <w:t>Vállalkozói díj</w:t>
-      </w:r>
-      <w:r>
-        <w:rPr>
-          <w:sz w:val="21"/>
-          <w:szCs w:val="21"/>
-        </w:rPr>
-        <w:t>.</w:t>
-      </w:r>
-    </w:p>
-    <w:p>
-      <w:pPr>
-        <w:tabs>
-          <w:tab w:val="left" w:pos="0"/>
-        </w:tabs>
-        <w:ind w:left="720"/>
-        <w:jc w:val="both"/>
-        <w:rPr>
-          <w:sz w:val="21"/>
-          <w:szCs w:val="21"/>
-        </w:rPr>
-      </w:pPr>
-    </w:p>
-    <w:p>
-      <w:pPr>
-        <w:tabs>
-          <w:tab w:val="left" w:pos="0"/>
-        </w:tabs>
-        <w:ind w:left="840"/>
-        <w:jc w:val="both"/>
-        <w:rPr>
-          <w:sz w:val="21"/>
-          <w:szCs w:val="21"/>
-        </w:rPr>
-      </w:pPr>
+          <w:sz w:val="21"/>
+          <w:szCs w:val="21"/>
+        </w:rPr>
+      </w:pPr>
+      <w:r>
+        <w:rPr>
+          <w:sz w:val="21"/>
+          <w:szCs w:val="21"/>
+        </w:rPr>
+        <w:t>vállalkozó által elvégzett kivitelezési munkának a díja (munkadíj):</w:t>
+      </w:r>
+      <w:r>
+        <w:rPr>
+          <w:sz w:val="21"/>
+          <w:szCs w:val="21"/>
+        </w:rPr>
+        <w:t xml:space="preserve"> </w:t>
+      </w:r>
+      <w:r>
+        <w:rPr>
+          <w:sz w:val="21"/>
+          <w:szCs w:val="21"/>
+        </w:rPr>
+        <w:t>[[</w:t>
+      </w:r>
+      <w:proofErr w:type="spellStart"/>
+      <w:r>
+        <w:rPr>
+          <w:sz w:val="21"/>
+          <w:szCs w:val="21"/>
+        </w:rPr>
+        <w:t>brszamoltertek</w:t>
+      </w:r>
+      <w:proofErr w:type="spellEnd"/>
+      <w:r>
+        <w:rPr>
+          <w:sz w:val="21"/>
+          <w:szCs w:val="21"/>
+        </w:rPr>
+        <w:t>]]</w:t>
+      </w:r>
     </w:p>
     <w:p>
       <w:pPr>
@@ -3969,7 +3892,56 @@
           <w:sz w:val="21"/>
           <w:szCs w:val="21"/>
         </w:rPr>
-        <w:t>A Megrendelő az utasításadási jogkörével élve nem adhat jogszabályi, vagy hatósági előírással (különösen a melléklet a 18/2025. (VII. 31.) EM rendelethez Az egyes energiahatékonyság-javító intézkedésekből származó energia megtakarítás mértékét meghatározó jegyzék) ellentétes utasítást a Kivitelezőnek. Amennyiben e rendelkezéstől eltérő, a Kivitelező köteles annak teljesítését megtagadni.</w:t>
+        <w:t xml:space="preserve">A Megrendelő az </w:t>
+      </w:r>
+      <w:r>
+        <w:rPr>
+          <w:sz w:val="21"/>
+          <w:szCs w:val="21"/>
+        </w:rPr>
+        <w:t>utasítás adás</w:t>
+      </w:r>
+      <w:r>
+        <w:rPr>
+          <w:sz w:val="21"/>
+          <w:szCs w:val="21"/>
+        </w:rPr>
+        <w:t xml:space="preserve"> </w:t>
+      </w:r>
+      <w:r>
+        <w:rPr>
+          <w:sz w:val="21"/>
+          <w:szCs w:val="21"/>
+        </w:rPr>
+        <w:t xml:space="preserve">jogkörével élve nem adhat jogszabályi, vagy hatósági előírással (különösen a melléklet a 18/2025. (VII. 31.) EM rendelethez Az egyes energiahatékonyság-javító intézkedésekből származó </w:t>
+      </w:r>
+      <w:r>
+        <w:rPr>
+          <w:sz w:val="21"/>
+          <w:szCs w:val="21"/>
+        </w:rPr>
+        <w:t>energiamegtakarítás</w:t>
+      </w:r>
+      <w:r>
+        <w:rPr>
+          <w:sz w:val="21"/>
+          <w:szCs w:val="21"/>
+        </w:rPr>
+        <w:t xml:space="preserve"> mértékét meghatározó jegyzék) ellentétes utasítást a Kivitelezőnek. Amennyiben e rendelkezéstől </w:t>
+      </w:r>
+      <w:r>
+        <w:rPr>
+          <w:sz w:val="21"/>
+          <w:szCs w:val="21"/>
+        </w:rPr>
+        <w:t>eltér</w:t>
+      </w:r>
+      <w:r>
+        <w:rPr>
+          <w:sz w:val="21"/>
+          <w:szCs w:val="21"/>
+        </w:rPr>
+        <w:t>, a Kivitelező köteles annak teljesítését megtagadni.</w:t>
       </w:r>
     </w:p>
     <w:p>
@@ -4294,7 +4266,7 @@
                     </pic:cNvPicPr>
                   </pic:nvPicPr>
                   <pic:blipFill>
-                    <a:blip r:embed="rId8" cstate="print">
+                    <a:blip r:embed="rId11" cstate="print">
                       <a:extLst>
                         <a:ext uri="{28A0092B-C50C-407E-A947-70E740481C1C}">
                           <a14:useLocalDpi xmlns:a14="http://schemas.microsoft.com/office/drawing/2010/main" val="0"/>
@@ -4434,7 +4406,7 @@
                     </pic:cNvPicPr>
                   </pic:nvPicPr>
                   <pic:blipFill>
-                    <a:blip r:embed="rId9" cstate="print">
+                    <a:blip r:embed="rId12" cstate="print">
                       <a:extLst>
                         <a:ext uri="{28A0092B-C50C-407E-A947-70E740481C1C}">
                           <a14:useLocalDpi xmlns:a14="http://schemas.microsoft.com/office/drawing/2010/main" val="0"/>
@@ -4834,10 +4806,25 @@
         </w:rPr>
       </w:pPr>
     </w:p>
-    <w:p/>
+    <w:p>
+      <w:pPr>
+        <w:tabs>
+          <w:tab w:val="left" w:pos="6120"/>
+        </w:tabs>
+        <w:ind w:left="720"/>
+        <w:jc w:val="both"/>
+        <w:rPr>
+          <w:sz w:val="21"/>
+        </w:rPr>
+      </w:pPr>
+    </w:p>
     <w:sectPr>
-      <w:footerReference w:type="even" r:id="rId10"/>
-      <w:footerReference w:type="default" r:id="rId11"/>
+      <w:headerReference w:type="even" r:id="rId13"/>
+      <w:headerReference w:type="default" r:id="rId14"/>
+      <w:footerReference w:type="even" r:id="rId15"/>
+      <w:footerReference w:type="default" r:id="rId16"/>
+      <w:headerReference w:type="first" r:id="rId17"/>
+      <w:footerReference w:type="first" r:id="rId18"/>
       <w:pgSz w:w="11906" w:h="16838"/>
       <w:pgMar w:top="851" w:right="851" w:bottom="851" w:left="851" w:header="709" w:footer="709" w:gutter="0"/>
       <w:pgNumType w:start="1"/>
@@ -5007,6 +4994,16 @@
 </w:ftr>
 </file>
 
+<file path=word/footer3.xml><?xml version="1.0" encoding="utf-8"?>
+<w:ftr xmlns:wpc="http://schemas.microsoft.com/office/word/2010/wordprocessingCanvas" xmlns:cx="http://schemas.microsoft.com/office/drawing/2014/chartex" xmlns:cx1="http://schemas.microsoft.com/office/drawing/2015/9/8/chartex" xmlns:cx2="http://schemas.microsoft.com/office/drawing/2015/10/21/chartex" xmlns:cx3="http://schemas.microsoft.com/office/drawing/2016/5/9/chartex" xmlns:cx4="http://schemas.microsoft.com/office/drawing/2016/5/10/chartex" xmlns:cx5="http://schemas.microsoft.com/office/drawing/2016/5/11/chartex" xmlns:cx6="http://schemas.microsoft.com/office/drawing/2016/5/12/chartex" xmlns:cx7="http://schemas.microsoft.com/office/drawing/2016/5/13/chartex" xmlns:cx8="http://schemas.microsoft.com/office/drawing/2016/5/14/chartex" xmlns:mc="http://schemas.openxmlformats.org/markup-compatibility/2006" xmlns:aink="http://schemas.microsoft.com/office/drawing/2016/ink" xmlns:am3d="http://schemas.microsoft.com/office/drawing/2017/model3d" xmlns:o="urn:schemas-microsoft-com:office:office" xmlns:oel="http://schemas.microsoft.com/office/2019/extlst" xmlns:r="http://schemas.openxmlformats.org/officeDocument/2006/relationships" xmlns:m="http://schemas.openxmlformats.org/officeDocument/2006/math" xmlns:v="urn:schemas-microsoft-com:vml" xmlns:wp14="http://schemas.microsoft.com/office/word/2010/wordprocessingDrawing" xmlns:wp="http://schemas.openxmlformats.org/drawingml/2006/wordprocessingDrawing" xmlns:w10="urn:schemas-microsoft-com:office:word" xmlns:w="http://schemas.openxmlformats.org/wordprocessingml/2006/main" xmlns:w14="http://schemas.microsoft.com/office/word/2010/wordml" xmlns:w15="http://schemas.microsoft.com/office/word/2012/wordml" xmlns:w16cex="http://schemas.microsoft.com/office/word/2018/wordml/cex" xmlns:w16cid="http://schemas.microsoft.com/office/word/2016/wordml/cid" xmlns:w16="http://schemas.microsoft.com/office/word/2018/wordml" xmlns:w16du="http://schemas.microsoft.com/office/word/2023/wordml/word16du" xmlns:w16sdtdh="http://schemas.microsoft.com/office/word/2020/wordml/sdtdatahash" xmlns:w16sdtfl="http://schemas.microsoft.com/office/word/2024/wordml/sdtformatlock" xmlns:w16se="http://schemas.microsoft.com/office/word/2015/wordml/symex" xmlns:wpg="http://schemas.microsoft.com/office/word/2010/wordprocessingGroup" xmlns:wpi="http://schemas.microsoft.com/office/word/2010/wordprocessingInk" xmlns:wne="http://schemas.microsoft.com/office/word/2006/wordml" xmlns:wps="http://schemas.microsoft.com/office/word/2010/wordprocessingShape" mc:Ignorable="w14 w15 w16se w16cid w16 w16cex w16sdtdh w16sdtfl w16du wp14">
+  <w:p>
+    <w:pPr>
+      <w:pStyle w:val="llb"/>
+    </w:pPr>
+  </w:p>
+</w:ftr>
+</file>
+
 <file path=word/footnotes.xml><?xml version="1.0" encoding="utf-8"?>
 <w:footnotes xmlns:wpc="http://schemas.microsoft.com/office/word/2010/wordprocessingCanvas" xmlns:cx="http://schemas.microsoft.com/office/drawing/2014/chartex" xmlns:cx1="http://schemas.microsoft.com/office/drawing/2015/9/8/chartex" xmlns:cx2="http://schemas.microsoft.com/office/drawing/2015/10/21/chartex" xmlns:cx3="http://schemas.microsoft.com/office/drawing/2016/5/9/chartex" xmlns:cx4="http://schemas.microsoft.com/office/drawing/2016/5/10/chartex" xmlns:cx5="http://schemas.microsoft.com/office/drawing/2016/5/11/chartex" xmlns:cx6="http://schemas.microsoft.com/office/drawing/2016/5/12/chartex" xmlns:cx7="http://schemas.microsoft.com/office/drawing/2016/5/13/chartex" xmlns:cx8="http://schemas.microsoft.com/office/drawing/2016/5/14/chartex" xmlns:mc="http://schemas.openxmlformats.org/markup-compatibility/2006" xmlns:aink="http://schemas.microsoft.com/office/drawing/2016/ink" xmlns:am3d="http://schemas.microsoft.com/office/drawing/2017/model3d" xmlns:o="urn:schemas-microsoft-com:office:office" xmlns:oel="http://schemas.microsoft.com/office/2019/extlst" xmlns:r="http://schemas.openxmlformats.org/officeDocument/2006/relationships" xmlns:m="http://schemas.openxmlformats.org/officeDocument/2006/math" xmlns:v="urn:schemas-microsoft-com:vml" xmlns:wp14="http://schemas.microsoft.com/office/word/2010/wordprocessingDrawing" xmlns:wp="http://schemas.openxmlformats.org/drawingml/2006/wordprocessingDrawing" xmlns:w10="urn:schemas-microsoft-com:office:word" xmlns:w="http://schemas.openxmlformats.org/wordprocessingml/2006/main" xmlns:w14="http://schemas.microsoft.com/office/word/2010/wordml" xmlns:w15="http://schemas.microsoft.com/office/word/2012/wordml" xmlns:w16cex="http://schemas.microsoft.com/office/word/2018/wordml/cex" xmlns:w16cid="http://schemas.microsoft.com/office/word/2016/wordml/cid" xmlns:w16="http://schemas.microsoft.com/office/word/2018/wordml" xmlns:w16du="http://schemas.microsoft.com/office/word/2023/wordml/word16du" xmlns:w16sdtdh="http://schemas.microsoft.com/office/word/2020/wordml/sdtdatahash" xmlns:w16sdtfl="http://schemas.microsoft.com/office/word/2024/wordml/sdtformatlock" xmlns:w16se="http://schemas.microsoft.com/office/word/2015/wordml/symex" xmlns:wpg="http://schemas.microsoft.com/office/word/2010/wordprocessingGroup" xmlns:wpi="http://schemas.microsoft.com/office/word/2010/wordprocessingInk" xmlns:wne="http://schemas.microsoft.com/office/word/2006/wordml" xmlns:wps="http://schemas.microsoft.com/office/word/2010/wordprocessingShape" mc:Ignorable="w14 w15 w16se w16cid w16 w16cex w16sdtdh w16sdtfl w16du wp14">
   <w:footnote w:type="separator" w:id="-1">
@@ -5024,11 +5021,162 @@
     </w:p>
   </w:footnote>
 </w:footnotes>
+</file>
+
+<file path=word/header1.xml><?xml version="1.0" encoding="utf-8"?>
+<w:hdr xmlns:wpc="http://schemas.microsoft.com/office/word/2010/wordprocessingCanvas" xmlns:cx="http://schemas.microsoft.com/office/drawing/2014/chartex" xmlns:cx1="http://schemas.microsoft.com/office/drawing/2015/9/8/chartex" xmlns:cx2="http://schemas.microsoft.com/office/drawing/2015/10/21/chartex" xmlns:cx3="http://schemas.microsoft.com/office/drawing/2016/5/9/chartex" xmlns:cx4="http://schemas.microsoft.com/office/drawing/2016/5/10/chartex" xmlns:cx5="http://schemas.microsoft.com/office/drawing/2016/5/11/chartex" xmlns:cx6="http://schemas.microsoft.com/office/drawing/2016/5/12/chartex" xmlns:cx7="http://schemas.microsoft.com/office/drawing/2016/5/13/chartex" xmlns:cx8="http://schemas.microsoft.com/office/drawing/2016/5/14/chartex" xmlns:mc="http://schemas.openxmlformats.org/markup-compatibility/2006" xmlns:aink="http://schemas.microsoft.com/office/drawing/2016/ink" xmlns:am3d="http://schemas.microsoft.com/office/drawing/2017/model3d" xmlns:o="urn:schemas-microsoft-com:office:office" xmlns:oel="http://schemas.microsoft.com/office/2019/extlst" xmlns:r="http://schemas.openxmlformats.org/officeDocument/2006/relationships" xmlns:m="http://schemas.openxmlformats.org/officeDocument/2006/math" xmlns:v="urn:schemas-microsoft-com:vml" xmlns:wp14="http://schemas.microsoft.com/office/word/2010/wordprocessingDrawing" xmlns:wp="http://schemas.openxmlformats.org/drawingml/2006/wordprocessingDrawing" xmlns:w10="urn:schemas-microsoft-com:office:word" xmlns:w="http://schemas.openxmlformats.org/wordprocessingml/2006/main" xmlns:w14="http://schemas.microsoft.com/office/word/2010/wordml" xmlns:w15="http://schemas.microsoft.com/office/word/2012/wordml" xmlns:w16cex="http://schemas.microsoft.com/office/word/2018/wordml/cex" xmlns:w16cid="http://schemas.microsoft.com/office/word/2016/wordml/cid" xmlns:w16="http://schemas.microsoft.com/office/word/2018/wordml" xmlns:w16du="http://schemas.microsoft.com/office/word/2023/wordml/word16du" xmlns:w16sdtdh="http://schemas.microsoft.com/office/word/2020/wordml/sdtdatahash" xmlns:w16sdtfl="http://schemas.microsoft.com/office/word/2024/wordml/sdtformatlock" xmlns:w16se="http://schemas.microsoft.com/office/word/2015/wordml/symex" xmlns:wpg="http://schemas.microsoft.com/office/word/2010/wordprocessingGroup" xmlns:wpi="http://schemas.microsoft.com/office/word/2010/wordprocessingInk" xmlns:wne="http://schemas.microsoft.com/office/word/2006/wordml" xmlns:wps="http://schemas.microsoft.com/office/word/2010/wordprocessingShape" mc:Ignorable="w14 w15 w16se w16cid w16 w16cex w16sdtdh w16sdtfl w16du wp14">
+  <w:p>
+    <w:pPr>
+      <w:pStyle w:val="lfej"/>
+    </w:pPr>
+  </w:p>
+</w:hdr>
+</file>
+
+<file path=word/header2.xml><?xml version="1.0" encoding="utf-8"?>
+<w:hdr xmlns:wpc="http://schemas.microsoft.com/office/word/2010/wordprocessingCanvas" xmlns:cx="http://schemas.microsoft.com/office/drawing/2014/chartex" xmlns:cx1="http://schemas.microsoft.com/office/drawing/2015/9/8/chartex" xmlns:cx2="http://schemas.microsoft.com/office/drawing/2015/10/21/chartex" xmlns:cx3="http://schemas.microsoft.com/office/drawing/2016/5/9/chartex" xmlns:cx4="http://schemas.microsoft.com/office/drawing/2016/5/10/chartex" xmlns:cx5="http://schemas.microsoft.com/office/drawing/2016/5/11/chartex" xmlns:cx6="http://schemas.microsoft.com/office/drawing/2016/5/12/chartex" xmlns:cx7="http://schemas.microsoft.com/office/drawing/2016/5/13/chartex" xmlns:cx8="http://schemas.microsoft.com/office/drawing/2016/5/14/chartex" xmlns:mc="http://schemas.openxmlformats.org/markup-compatibility/2006" xmlns:aink="http://schemas.microsoft.com/office/drawing/2016/ink" xmlns:am3d="http://schemas.microsoft.com/office/drawing/2017/model3d" xmlns:o="urn:schemas-microsoft-com:office:office" xmlns:oel="http://schemas.microsoft.com/office/2019/extlst" xmlns:r="http://schemas.openxmlformats.org/officeDocument/2006/relationships" xmlns:m="http://schemas.openxmlformats.org/officeDocument/2006/math" xmlns:v="urn:schemas-microsoft-com:vml" xmlns:wp14="http://schemas.microsoft.com/office/word/2010/wordprocessingDrawing" xmlns:wp="http://schemas.openxmlformats.org/drawingml/2006/wordprocessingDrawing" xmlns:w10="urn:schemas-microsoft-com:office:word" xmlns:w="http://schemas.openxmlformats.org/wordprocessingml/2006/main" xmlns:w14="http://schemas.microsoft.com/office/word/2010/wordml" xmlns:w15="http://schemas.microsoft.com/office/word/2012/wordml" xmlns:w16cex="http://schemas.microsoft.com/office/word/2018/wordml/cex" xmlns:w16cid="http://schemas.microsoft.com/office/word/2016/wordml/cid" xmlns:w16="http://schemas.microsoft.com/office/word/2018/wordml" xmlns:w16du="http://schemas.microsoft.com/office/word/2023/wordml/word16du" xmlns:w16sdtdh="http://schemas.microsoft.com/office/word/2020/wordml/sdtdatahash" xmlns:w16sdtfl="http://schemas.microsoft.com/office/word/2024/wordml/sdtformatlock" xmlns:w16se="http://schemas.microsoft.com/office/word/2015/wordml/symex" xmlns:wpg="http://schemas.microsoft.com/office/word/2010/wordprocessingGroup" xmlns:wpi="http://schemas.microsoft.com/office/word/2010/wordprocessingInk" xmlns:wne="http://schemas.microsoft.com/office/word/2006/wordml" xmlns:wps="http://schemas.microsoft.com/office/word/2010/wordprocessingShape" mc:Ignorable="w14 w15 w16se w16cid w16 w16cex w16sdtdh w16sdtfl w16du wp14">
+  <w:p>
+    <w:pPr>
+      <w:pStyle w:val="lfej"/>
+    </w:pPr>
+  </w:p>
+</w:hdr>
+</file>
+
+<file path=word/header3.xml><?xml version="1.0" encoding="utf-8"?>
+<w:hdr xmlns:wpc="http://schemas.microsoft.com/office/word/2010/wordprocessingCanvas" xmlns:cx="http://schemas.microsoft.com/office/drawing/2014/chartex" xmlns:cx1="http://schemas.microsoft.com/office/drawing/2015/9/8/chartex" xmlns:cx2="http://schemas.microsoft.com/office/drawing/2015/10/21/chartex" xmlns:cx3="http://schemas.microsoft.com/office/drawing/2016/5/9/chartex" xmlns:cx4="http://schemas.microsoft.com/office/drawing/2016/5/10/chartex" xmlns:cx5="http://schemas.microsoft.com/office/drawing/2016/5/11/chartex" xmlns:cx6="http://schemas.microsoft.com/office/drawing/2016/5/12/chartex" xmlns:cx7="http://schemas.microsoft.com/office/drawing/2016/5/13/chartex" xmlns:cx8="http://schemas.microsoft.com/office/drawing/2016/5/14/chartex" xmlns:mc="http://schemas.openxmlformats.org/markup-compatibility/2006" xmlns:aink="http://schemas.microsoft.com/office/drawing/2016/ink" xmlns:am3d="http://schemas.microsoft.com/office/drawing/2017/model3d" xmlns:o="urn:schemas-microsoft-com:office:office" xmlns:oel="http://schemas.microsoft.com/office/2019/extlst" xmlns:r="http://schemas.openxmlformats.org/officeDocument/2006/relationships" xmlns:m="http://schemas.openxmlformats.org/officeDocument/2006/math" xmlns:v="urn:schemas-microsoft-com:vml" xmlns:wp14="http://schemas.microsoft.com/office/word/2010/wordprocessingDrawing" xmlns:wp="http://schemas.openxmlformats.org/drawingml/2006/wordprocessingDrawing" xmlns:w10="urn:schemas-microsoft-com:office:word" xmlns:w="http://schemas.openxmlformats.org/wordprocessingml/2006/main" xmlns:w14="http://schemas.microsoft.com/office/word/2010/wordml" xmlns:w15="http://schemas.microsoft.com/office/word/2012/wordml" xmlns:w16cex="http://schemas.microsoft.com/office/word/2018/wordml/cex" xmlns:w16cid="http://schemas.microsoft.com/office/word/2016/wordml/cid" xmlns:w16="http://schemas.microsoft.com/office/word/2018/wordml" xmlns:w16du="http://schemas.microsoft.com/office/word/2023/wordml/word16du" xmlns:w16sdtdh="http://schemas.microsoft.com/office/word/2020/wordml/sdtdatahash" xmlns:w16sdtfl="http://schemas.microsoft.com/office/word/2024/wordml/sdtformatlock" xmlns:w16se="http://schemas.microsoft.com/office/word/2015/wordml/symex" xmlns:wpg="http://schemas.microsoft.com/office/word/2010/wordprocessingGroup" xmlns:wpi="http://schemas.microsoft.com/office/word/2010/wordprocessingInk" xmlns:wne="http://schemas.microsoft.com/office/word/2006/wordml" xmlns:wps="http://schemas.microsoft.com/office/word/2010/wordprocessingShape" mc:Ignorable="w14 w15 w16se w16cid w16 w16cex w16sdtdh w16sdtfl w16du wp14">
+  <w:p>
+    <w:pPr>
+      <w:pStyle w:val="lfej"/>
+    </w:pPr>
+  </w:p>
+</w:hdr>
 </file>
 
 <file path=word/numbering.xml><?xml version="1.0" encoding="utf-8"?>
 <w:numbering xmlns:wpc="http://schemas.microsoft.com/office/word/2010/wordprocessingCanvas" xmlns:cx="http://schemas.microsoft.com/office/drawing/2014/chartex" xmlns:cx1="http://schemas.microsoft.com/office/drawing/2015/9/8/chartex" xmlns:cx2="http://schemas.microsoft.com/office/drawing/2015/10/21/chartex" xmlns:cx3="http://schemas.microsoft.com/office/drawing/2016/5/9/chartex" xmlns:cx4="http://schemas.microsoft.com/office/drawing/2016/5/10/chartex" xmlns:cx5="http://schemas.microsoft.com/office/drawing/2016/5/11/chartex" xmlns:cx6="http://schemas.microsoft.com/office/drawing/2016/5/12/chartex" xmlns:cx7="http://schemas.microsoft.com/office/drawing/2016/5/13/chartex" xmlns:cx8="http://schemas.microsoft.com/office/drawing/2016/5/14/chartex" xmlns:mc="http://schemas.openxmlformats.org/markup-compatibility/2006" xmlns:aink="http://schemas.microsoft.com/office/drawing/2016/ink" xmlns:am3d="http://schemas.microsoft.com/office/drawing/2017/model3d" xmlns:o="urn:schemas-microsoft-com:office:office" xmlns:oel="http://schemas.microsoft.com/office/2019/extlst" xmlns:r="http://schemas.openxmlformats.org/officeDocument/2006/relationships" xmlns:m="http://schemas.openxmlformats.org/officeDocument/2006/math" xmlns:v="urn:schemas-microsoft-com:vml" xmlns:wp14="http://schemas.microsoft.com/office/word/2010/wordprocessingDrawing" xmlns:wp="http://schemas.openxmlformats.org/drawingml/2006/wordprocessingDrawing" xmlns:w10="urn:schemas-microsoft-com:office:word" xmlns:w="http://schemas.openxmlformats.org/wordprocessingml/2006/main" xmlns:w14="http://schemas.microsoft.com/office/word/2010/wordml" xmlns:w15="http://schemas.microsoft.com/office/word/2012/wordml" xmlns:w16cex="http://schemas.microsoft.com/office/word/2018/wordml/cex" xmlns:w16cid="http://schemas.microsoft.com/office/word/2016/wordml/cid" xmlns:w16="http://schemas.microsoft.com/office/word/2018/wordml" xmlns:w16du="http://schemas.microsoft.com/office/word/2023/wordml/word16du" xmlns:w16sdtdh="http://schemas.microsoft.com/office/word/2020/wordml/sdtdatahash" xmlns:w16sdtfl="http://schemas.microsoft.com/office/word/2024/wordml/sdtformatlock" xmlns:w16se="http://schemas.microsoft.com/office/word/2015/wordml/symex" xmlns:wpg="http://schemas.microsoft.com/office/word/2010/wordprocessingGroup" xmlns:wpi="http://schemas.microsoft.com/office/word/2010/wordprocessingInk" xmlns:wne="http://schemas.microsoft.com/office/word/2006/wordml" xmlns:wps="http://schemas.microsoft.com/office/word/2010/wordprocessingShape" mc:Ignorable="w14 w15 w16se w16cid w16 w16cex w16sdtdh w16sdtfl w16du wp14">
   <w:abstractNum w:abstractNumId="0" w15:restartNumberingAfterBreak="0">
+    <w:nsid w:val="0ABA24CE"/>
+    <w:multiLevelType w:val="multilevel"/>
+    <w:tmpl w:val="4EE4D5DC"/>
+    <w:lvl w:ilvl="0">
+      <w:start w:val="1"/>
+      <w:numFmt w:val="decimal"/>
+      <w:lvlText w:val="%1."/>
+      <w:lvlJc w:val="left"/>
+      <w:pPr>
+        <w:ind w:left="720" w:hanging="360"/>
+      </w:pPr>
+      <w:rPr>
+        <w:rFonts w:hint="default"/>
+      </w:rPr>
+    </w:lvl>
+    <w:lvl w:ilvl="1">
+      <w:start w:val="1"/>
+      <w:numFmt w:val="decimal"/>
+      <w:isLgl/>
+      <w:lvlText w:val="%1.%2."/>
+      <w:lvlJc w:val="left"/>
+      <w:pPr>
+        <w:ind w:left="840" w:hanging="480"/>
+      </w:pPr>
+      <w:rPr>
+        <w:rFonts w:hint="default"/>
+      </w:rPr>
+    </w:lvl>
+    <w:lvl w:ilvl="2">
+      <w:start w:val="1"/>
+      <w:numFmt w:val="decimal"/>
+      <w:isLgl/>
+      <w:lvlText w:val="%1.%2.%3."/>
+      <w:lvlJc w:val="left"/>
+      <w:pPr>
+        <w:ind w:left="1080" w:hanging="720"/>
+      </w:pPr>
+      <w:rPr>
+        <w:rFonts w:hint="default"/>
+      </w:rPr>
+    </w:lvl>
+    <w:lvl w:ilvl="3">
+      <w:start w:val="1"/>
+      <w:numFmt w:val="decimal"/>
+      <w:isLgl/>
+      <w:lvlText w:val="%1.%2.%3.%4."/>
+      <w:lvlJc w:val="left"/>
+      <w:pPr>
+        <w:ind w:left="1080" w:hanging="720"/>
+      </w:pPr>
+      <w:rPr>
+        <w:rFonts w:hint="default"/>
+      </w:rPr>
+    </w:lvl>
+    <w:lvl w:ilvl="4">
+      <w:start w:val="1"/>
+      <w:numFmt w:val="decimal"/>
+      <w:isLgl/>
+      <w:lvlText w:val="%1.%2.%3.%4.%5."/>
+      <w:lvlJc w:val="left"/>
+      <w:pPr>
+        <w:ind w:left="1440" w:hanging="1080"/>
+      </w:pPr>
+      <w:rPr>
+        <w:rFonts w:hint="default"/>
+      </w:rPr>
+    </w:lvl>
+    <w:lvl w:ilvl="5">
+      <w:start w:val="1"/>
+      <w:numFmt w:val="decimal"/>
+      <w:isLgl/>
+      <w:lvlText w:val="%1.%2.%3.%4.%5.%6."/>
+      <w:lvlJc w:val="left"/>
+      <w:pPr>
+        <w:ind w:left="1440" w:hanging="1080"/>
+      </w:pPr>
+      <w:rPr>
+        <w:rFonts w:hint="default"/>
+      </w:rPr>
+    </w:lvl>
+    <w:lvl w:ilvl="6">
+      <w:start w:val="1"/>
+      <w:numFmt w:val="decimal"/>
+      <w:isLgl/>
+      <w:lvlText w:val="%1.%2.%3.%4.%5.%6.%7."/>
+      <w:lvlJc w:val="left"/>
+      <w:pPr>
+        <w:ind w:left="1800" w:hanging="1440"/>
+      </w:pPr>
+      <w:rPr>
+        <w:rFonts w:hint="default"/>
+      </w:rPr>
+    </w:lvl>
+    <w:lvl w:ilvl="7">
+      <w:start w:val="1"/>
+      <w:numFmt w:val="decimal"/>
+      <w:isLgl/>
+      <w:lvlText w:val="%1.%2.%3.%4.%5.%6.%7.%8."/>
+      <w:lvlJc w:val="left"/>
+      <w:pPr>
+        <w:ind w:left="1800" w:hanging="1440"/>
+      </w:pPr>
+      <w:rPr>
+        <w:rFonts w:hint="default"/>
+      </w:rPr>
+    </w:lvl>
+    <w:lvl w:ilvl="8">
+      <w:start w:val="1"/>
+      <w:numFmt w:val="decimal"/>
+      <w:isLgl/>
+      <w:lvlText w:val="%1.%2.%3.%4.%5.%6.%7.%8.%9."/>
+      <w:lvlJc w:val="left"/>
+      <w:pPr>
+        <w:ind w:left="2160" w:hanging="1800"/>
+      </w:pPr>
+      <w:rPr>
+        <w:rFonts w:hint="default"/>
+      </w:rPr>
+    </w:lvl>
+  </w:abstractNum>
+  <w:abstractNum w:abstractNumId="1" w15:restartNumberingAfterBreak="0">
     <w:nsid w:val="0C110C97"/>
     <w:multiLevelType w:val="multilevel"/>
     <w:tmpl w:val="75E2F150"/>
@@ -5114,7 +5262,794 @@
       </w:pPr>
     </w:lvl>
   </w:abstractNum>
-  <w:abstractNum w:abstractNumId="1" w15:restartNumberingAfterBreak="0">
+  <w:abstractNum w:abstractNumId="2" w15:restartNumberingAfterBreak="0">
+    <w:nsid w:val="236D4A86"/>
+    <w:multiLevelType w:val="multilevel"/>
+    <w:tmpl w:val="26841C28"/>
+    <w:lvl w:ilvl="0">
+      <w:start w:val="1"/>
+      <w:numFmt w:val="decimal"/>
+      <w:lvlText w:val="%1."/>
+      <w:lvlJc w:val="left"/>
+      <w:pPr>
+        <w:ind w:left="720" w:hanging="360"/>
+      </w:pPr>
+    </w:lvl>
+    <w:lvl w:ilvl="1">
+      <w:start w:val="1"/>
+      <w:numFmt w:val="decimal"/>
+      <w:isLgl/>
+      <w:lvlText w:val="%1.%2."/>
+      <w:lvlJc w:val="left"/>
+      <w:pPr>
+        <w:ind w:left="720" w:hanging="360"/>
+      </w:pPr>
+      <w:rPr>
+        <w:rFonts w:hint="default"/>
+      </w:rPr>
+    </w:lvl>
+    <w:lvl w:ilvl="2">
+      <w:start w:val="1"/>
+      <w:numFmt w:val="decimal"/>
+      <w:isLgl/>
+      <w:lvlText w:val="%1.%2.%3."/>
+      <w:lvlJc w:val="left"/>
+      <w:pPr>
+        <w:ind w:left="1080" w:hanging="720"/>
+      </w:pPr>
+      <w:rPr>
+        <w:rFonts w:hint="default"/>
+      </w:rPr>
+    </w:lvl>
+    <w:lvl w:ilvl="3">
+      <w:start w:val="1"/>
+      <w:numFmt w:val="decimal"/>
+      <w:isLgl/>
+      <w:lvlText w:val="%1.%2.%3.%4."/>
+      <w:lvlJc w:val="left"/>
+      <w:pPr>
+        <w:ind w:left="1080" w:hanging="720"/>
+      </w:pPr>
+      <w:rPr>
+        <w:rFonts w:hint="default"/>
+      </w:rPr>
+    </w:lvl>
+    <w:lvl w:ilvl="4">
+      <w:start w:val="1"/>
+      <w:numFmt w:val="decimal"/>
+      <w:isLgl/>
+      <w:lvlText w:val="%1.%2.%3.%4.%5."/>
+      <w:lvlJc w:val="left"/>
+      <w:pPr>
+        <w:ind w:left="1440" w:hanging="1080"/>
+      </w:pPr>
+      <w:rPr>
+        <w:rFonts w:hint="default"/>
+      </w:rPr>
+    </w:lvl>
+    <w:lvl w:ilvl="5">
+      <w:start w:val="1"/>
+      <w:numFmt w:val="decimal"/>
+      <w:isLgl/>
+      <w:lvlText w:val="%1.%2.%3.%4.%5.%6."/>
+      <w:lvlJc w:val="left"/>
+      <w:pPr>
+        <w:ind w:left="1440" w:hanging="1080"/>
+      </w:pPr>
+      <w:rPr>
+        <w:rFonts w:hint="default"/>
+      </w:rPr>
+    </w:lvl>
+    <w:lvl w:ilvl="6">
+      <w:start w:val="1"/>
+      <w:numFmt w:val="decimal"/>
+      <w:isLgl/>
+      <w:lvlText w:val="%1.%2.%3.%4.%5.%6.%7."/>
+      <w:lvlJc w:val="left"/>
+      <w:pPr>
+        <w:ind w:left="1800" w:hanging="1440"/>
+      </w:pPr>
+      <w:rPr>
+        <w:rFonts w:hint="default"/>
+      </w:rPr>
+    </w:lvl>
+    <w:lvl w:ilvl="7">
+      <w:start w:val="1"/>
+      <w:numFmt w:val="decimal"/>
+      <w:isLgl/>
+      <w:lvlText w:val="%1.%2.%3.%4.%5.%6.%7.%8."/>
+      <w:lvlJc w:val="left"/>
+      <w:pPr>
+        <w:ind w:left="1800" w:hanging="1440"/>
+      </w:pPr>
+      <w:rPr>
+        <w:rFonts w:hint="default"/>
+      </w:rPr>
+    </w:lvl>
+    <w:lvl w:ilvl="8">
+      <w:start w:val="1"/>
+      <w:numFmt w:val="decimal"/>
+      <w:isLgl/>
+      <w:lvlText w:val="%1.%2.%3.%4.%5.%6.%7.%8.%9."/>
+      <w:lvlJc w:val="left"/>
+      <w:pPr>
+        <w:ind w:left="1800" w:hanging="1440"/>
+      </w:pPr>
+      <w:rPr>
+        <w:rFonts w:hint="default"/>
+      </w:rPr>
+    </w:lvl>
+  </w:abstractNum>
+  <w:abstractNum w:abstractNumId="3" w15:restartNumberingAfterBreak="0">
+    <w:nsid w:val="27B91B15"/>
+    <w:multiLevelType w:val="hybridMultilevel"/>
+    <w:tmpl w:val="A328B6F8"/>
+    <w:lvl w:ilvl="0" w:tplc="040E0011">
+      <w:start w:val="1"/>
+      <w:numFmt w:val="decimal"/>
+      <w:lvlText w:val="%1)"/>
+      <w:lvlJc w:val="left"/>
+      <w:pPr>
+        <w:tabs>
+          <w:tab w:val="num" w:pos="720"/>
+        </w:tabs>
+        <w:ind w:left="720" w:hanging="360"/>
+      </w:pPr>
+      <w:rPr>
+        <w:rFonts w:hint="default"/>
+      </w:rPr>
+    </w:lvl>
+    <w:lvl w:ilvl="1" w:tplc="DE7E2182">
+      <w:start w:val="1"/>
+      <w:numFmt w:val="lowerLetter"/>
+      <w:lvlText w:val="%2)"/>
+      <w:lvlJc w:val="left"/>
+      <w:pPr>
+        <w:tabs>
+          <w:tab w:val="num" w:pos="1440"/>
+        </w:tabs>
+        <w:ind w:left="1440" w:hanging="360"/>
+      </w:pPr>
+      <w:rPr>
+        <w:rFonts w:hint="default"/>
+      </w:rPr>
+    </w:lvl>
+    <w:lvl w:ilvl="2" w:tplc="040E001B" w:tentative="1">
+      <w:start w:val="1"/>
+      <w:numFmt w:val="lowerRoman"/>
+      <w:lvlText w:val="%3."/>
+      <w:lvlJc w:val="right"/>
+      <w:pPr>
+        <w:tabs>
+          <w:tab w:val="num" w:pos="2160"/>
+        </w:tabs>
+        <w:ind w:left="2160" w:hanging="180"/>
+      </w:pPr>
+    </w:lvl>
+    <w:lvl w:ilvl="3" w:tplc="040E000F" w:tentative="1">
+      <w:start w:val="1"/>
+      <w:numFmt w:val="decimal"/>
+      <w:lvlText w:val="%4."/>
+      <w:lvlJc w:val="left"/>
+      <w:pPr>
+        <w:tabs>
+          <w:tab w:val="num" w:pos="2880"/>
+        </w:tabs>
+        <w:ind w:left="2880" w:hanging="360"/>
+      </w:pPr>
+    </w:lvl>
+    <w:lvl w:ilvl="4" w:tplc="040E0019" w:tentative="1">
+      <w:start w:val="1"/>
+      <w:numFmt w:val="lowerLetter"/>
+      <w:lvlText w:val="%5."/>
+      <w:lvlJc w:val="left"/>
+      <w:pPr>
+        <w:tabs>
+          <w:tab w:val="num" w:pos="3600"/>
+        </w:tabs>
+        <w:ind w:left="3600" w:hanging="360"/>
+      </w:pPr>
+    </w:lvl>
+    <w:lvl w:ilvl="5" w:tplc="040E001B" w:tentative="1">
+      <w:start w:val="1"/>
+      <w:numFmt w:val="lowerRoman"/>
+      <w:lvlText w:val="%6."/>
+      <w:lvlJc w:val="right"/>
+      <w:pPr>
+        <w:tabs>
+          <w:tab w:val="num" w:pos="4320"/>
+        </w:tabs>
+        <w:ind w:left="4320" w:hanging="180"/>
+      </w:pPr>
+    </w:lvl>
+    <w:lvl w:ilvl="6" w:tplc="040E000F" w:tentative="1">
+      <w:start w:val="1"/>
+      <w:numFmt w:val="decimal"/>
+      <w:lvlText w:val="%7."/>
+      <w:lvlJc w:val="left"/>
+      <w:pPr>
+        <w:tabs>
+          <w:tab w:val="num" w:pos="5040"/>
+        </w:tabs>
+        <w:ind w:left="5040" w:hanging="360"/>
+      </w:pPr>
+    </w:lvl>
+    <w:lvl w:ilvl="7" w:tplc="040E0019" w:tentative="1">
+      <w:start w:val="1"/>
+      <w:numFmt w:val="lowerLetter"/>
+      <w:lvlText w:val="%8."/>
+      <w:lvlJc w:val="left"/>
+      <w:pPr>
+        <w:tabs>
+          <w:tab w:val="num" w:pos="5760"/>
+        </w:tabs>
+        <w:ind w:left="5760" w:hanging="360"/>
+      </w:pPr>
+    </w:lvl>
+    <w:lvl w:ilvl="8" w:tplc="040E001B" w:tentative="1">
+      <w:start w:val="1"/>
+      <w:numFmt w:val="lowerRoman"/>
+      <w:lvlText w:val="%9."/>
+      <w:lvlJc w:val="right"/>
+      <w:pPr>
+        <w:tabs>
+          <w:tab w:val="num" w:pos="6480"/>
+        </w:tabs>
+        <w:ind w:left="6480" w:hanging="180"/>
+      </w:pPr>
+    </w:lvl>
+  </w:abstractNum>
+  <w:abstractNum w:abstractNumId="4" w15:restartNumberingAfterBreak="0">
+    <w:nsid w:val="399E31AF"/>
+    <w:multiLevelType w:val="hybridMultilevel"/>
+    <w:tmpl w:val="37D2F304"/>
+    <w:lvl w:ilvl="0" w:tplc="E5A202D6">
+      <w:start w:val="1"/>
+      <w:numFmt w:val="bullet"/>
+      <w:lvlText w:val="-"/>
+      <w:lvlJc w:val="left"/>
+      <w:pPr>
+        <w:ind w:left="720" w:hanging="360"/>
+      </w:pPr>
+      <w:rPr>
+        <w:rFonts w:ascii="Times New Roman" w:eastAsia="Times New Roman" w:hAnsi="Times New Roman" w:cs="Times New Roman" w:hint="default"/>
+      </w:rPr>
+    </w:lvl>
+    <w:lvl w:ilvl="1" w:tplc="040E0003" w:tentative="1">
+      <w:start w:val="1"/>
+      <w:numFmt w:val="bullet"/>
+      <w:lvlText w:val="o"/>
+      <w:lvlJc w:val="left"/>
+      <w:pPr>
+        <w:ind w:left="1440" w:hanging="360"/>
+      </w:pPr>
+      <w:rPr>
+        <w:rFonts w:ascii="Courier New" w:hAnsi="Courier New" w:cs="Courier New" w:hint="default"/>
+      </w:rPr>
+    </w:lvl>
+    <w:lvl w:ilvl="2" w:tplc="040E0005" w:tentative="1">
+      <w:start w:val="1"/>
+      <w:numFmt w:val="bullet"/>
+      <w:lvlText w:val=""/>
+      <w:lvlJc w:val="left"/>
+      <w:pPr>
+        <w:ind w:left="2160" w:hanging="360"/>
+      </w:pPr>
+      <w:rPr>
+        <w:rFonts w:ascii="Wingdings" w:hAnsi="Wingdings" w:hint="default"/>
+      </w:rPr>
+    </w:lvl>
+    <w:lvl w:ilvl="3" w:tplc="040E0001" w:tentative="1">
+      <w:start w:val="1"/>
+      <w:numFmt w:val="bullet"/>
+      <w:lvlText w:val=""/>
+      <w:lvlJc w:val="left"/>
+      <w:pPr>
+        <w:ind w:left="2880" w:hanging="360"/>
+      </w:pPr>
+      <w:rPr>
+        <w:rFonts w:ascii="Symbol" w:hAnsi="Symbol" w:hint="default"/>
+      </w:rPr>
+    </w:lvl>
+    <w:lvl w:ilvl="4" w:tplc="040E0003" w:tentative="1">
+      <w:start w:val="1"/>
+      <w:numFmt w:val="bullet"/>
+      <w:lvlText w:val="o"/>
+      <w:lvlJc w:val="left"/>
+      <w:pPr>
+        <w:ind w:left="3600" w:hanging="360"/>
+      </w:pPr>
+      <w:rPr>
+        <w:rFonts w:ascii="Courier New" w:hAnsi="Courier New" w:cs="Courier New" w:hint="default"/>
+      </w:rPr>
+    </w:lvl>
+    <w:lvl w:ilvl="5" w:tplc="040E0005" w:tentative="1">
+      <w:start w:val="1"/>
+      <w:numFmt w:val="bullet"/>
+      <w:lvlText w:val=""/>
+      <w:lvlJc w:val="left"/>
+      <w:pPr>
+        <w:ind w:left="4320" w:hanging="360"/>
+      </w:pPr>
+      <w:rPr>
+        <w:rFonts w:ascii="Wingdings" w:hAnsi="Wingdings" w:hint="default"/>
+      </w:rPr>
+    </w:lvl>
+    <w:lvl w:ilvl="6" w:tplc="040E0001" w:tentative="1">
+      <w:start w:val="1"/>
+      <w:numFmt w:val="bullet"/>
+      <w:lvlText w:val=""/>
+      <w:lvlJc w:val="left"/>
+      <w:pPr>
+        <w:ind w:left="5040" w:hanging="360"/>
+      </w:pPr>
+      <w:rPr>
+        <w:rFonts w:ascii="Symbol" w:hAnsi="Symbol" w:hint="default"/>
+      </w:rPr>
+    </w:lvl>
+    <w:lvl w:ilvl="7" w:tplc="040E0003" w:tentative="1">
+      <w:start w:val="1"/>
+      <w:numFmt w:val="bullet"/>
+      <w:lvlText w:val="o"/>
+      <w:lvlJc w:val="left"/>
+      <w:pPr>
+        <w:ind w:left="5760" w:hanging="360"/>
+      </w:pPr>
+      <w:rPr>
+        <w:rFonts w:ascii="Courier New" w:hAnsi="Courier New" w:cs="Courier New" w:hint="default"/>
+      </w:rPr>
+    </w:lvl>
+    <w:lvl w:ilvl="8" w:tplc="040E0005" w:tentative="1">
+      <w:start w:val="1"/>
+      <w:numFmt w:val="bullet"/>
+      <w:lvlText w:val=""/>
+      <w:lvlJc w:val="left"/>
+      <w:pPr>
+        <w:ind w:left="6480" w:hanging="360"/>
+      </w:pPr>
+      <w:rPr>
+        <w:rFonts w:ascii="Wingdings" w:hAnsi="Wingdings" w:hint="default"/>
+      </w:rPr>
+    </w:lvl>
+  </w:abstractNum>
+  <w:abstractNum w:abstractNumId="5" w15:restartNumberingAfterBreak="0">
+    <w:nsid w:val="39CA43CC"/>
+    <w:multiLevelType w:val="hybridMultilevel"/>
+    <w:tmpl w:val="57165BE8"/>
+    <w:lvl w:ilvl="0" w:tplc="9A8A31DE">
+      <w:start w:val="1"/>
+      <w:numFmt w:val="lowerLetter"/>
+      <w:lvlText w:val="%1)"/>
+      <w:lvlJc w:val="left"/>
+      <w:pPr>
+        <w:ind w:left="786" w:hanging="360"/>
+      </w:pPr>
+      <w:rPr>
+        <w:rFonts w:hint="default"/>
+      </w:rPr>
+    </w:lvl>
+    <w:lvl w:ilvl="1" w:tplc="040E0019" w:tentative="1">
+      <w:start w:val="1"/>
+      <w:numFmt w:val="lowerLetter"/>
+      <w:lvlText w:val="%2."/>
+      <w:lvlJc w:val="left"/>
+      <w:pPr>
+        <w:ind w:left="1506" w:hanging="360"/>
+      </w:pPr>
+    </w:lvl>
+    <w:lvl w:ilvl="2" w:tplc="040E001B" w:tentative="1">
+      <w:start w:val="1"/>
+      <w:numFmt w:val="lowerRoman"/>
+      <w:lvlText w:val="%3."/>
+      <w:lvlJc w:val="right"/>
+      <w:pPr>
+        <w:ind w:left="2226" w:hanging="180"/>
+      </w:pPr>
+    </w:lvl>
+    <w:lvl w:ilvl="3" w:tplc="040E000F" w:tentative="1">
+      <w:start w:val="1"/>
+      <w:numFmt w:val="decimal"/>
+      <w:lvlText w:val="%4."/>
+      <w:lvlJc w:val="left"/>
+      <w:pPr>
+        <w:ind w:left="2946" w:hanging="360"/>
+      </w:pPr>
+    </w:lvl>
+    <w:lvl w:ilvl="4" w:tplc="040E0019" w:tentative="1">
+      <w:start w:val="1"/>
+      <w:numFmt w:val="lowerLetter"/>
+      <w:lvlText w:val="%5."/>
+      <w:lvlJc w:val="left"/>
+      <w:pPr>
+        <w:ind w:left="3666" w:hanging="360"/>
+      </w:pPr>
+    </w:lvl>
+    <w:lvl w:ilvl="5" w:tplc="040E001B" w:tentative="1">
+      <w:start w:val="1"/>
+      <w:numFmt w:val="lowerRoman"/>
+      <w:lvlText w:val="%6."/>
+      <w:lvlJc w:val="right"/>
+      <w:pPr>
+        <w:ind w:left="4386" w:hanging="180"/>
+      </w:pPr>
+    </w:lvl>
+    <w:lvl w:ilvl="6" w:tplc="040E000F" w:tentative="1">
+      <w:start w:val="1"/>
+      <w:numFmt w:val="decimal"/>
+      <w:lvlText w:val="%7."/>
+      <w:lvlJc w:val="left"/>
+      <w:pPr>
+        <w:ind w:left="5106" w:hanging="360"/>
+      </w:pPr>
+    </w:lvl>
+    <w:lvl w:ilvl="7" w:tplc="040E0019" w:tentative="1">
+      <w:start w:val="1"/>
+      <w:numFmt w:val="lowerLetter"/>
+      <w:lvlText w:val="%8."/>
+      <w:lvlJc w:val="left"/>
+      <w:pPr>
+        <w:ind w:left="5826" w:hanging="360"/>
+      </w:pPr>
+    </w:lvl>
+    <w:lvl w:ilvl="8" w:tplc="040E001B" w:tentative="1">
+      <w:start w:val="1"/>
+      <w:numFmt w:val="lowerRoman"/>
+      <w:lvlText w:val="%9."/>
+      <w:lvlJc w:val="right"/>
+      <w:pPr>
+        <w:ind w:left="6546" w:hanging="180"/>
+      </w:pPr>
+    </w:lvl>
+  </w:abstractNum>
+  <w:abstractNum w:abstractNumId="6" w15:restartNumberingAfterBreak="0">
+    <w:nsid w:val="423532A1"/>
+    <w:multiLevelType w:val="hybridMultilevel"/>
+    <w:tmpl w:val="EBAA9AD4"/>
+    <w:lvl w:ilvl="0" w:tplc="A52E4F5A">
+      <w:start w:val="1"/>
+      <w:numFmt w:val="lowerLetter"/>
+      <w:lvlText w:val="%1)"/>
+      <w:lvlJc w:val="left"/>
+      <w:pPr>
+        <w:tabs>
+          <w:tab w:val="num" w:pos="1275"/>
+        </w:tabs>
+        <w:ind w:left="1275" w:hanging="360"/>
+      </w:pPr>
+      <w:rPr>
+        <w:rFonts w:hint="default"/>
+      </w:rPr>
+    </w:lvl>
+    <w:lvl w:ilvl="1" w:tplc="3BC696F6">
+      <w:start w:val="6"/>
+      <w:numFmt w:val="decimal"/>
+      <w:lvlText w:val="%2)"/>
+      <w:lvlJc w:val="left"/>
+      <w:pPr>
+        <w:tabs>
+          <w:tab w:val="num" w:pos="1995"/>
+        </w:tabs>
+        <w:ind w:left="1995" w:hanging="360"/>
+      </w:pPr>
+      <w:rPr>
+        <w:rFonts w:hint="default"/>
+      </w:rPr>
+    </w:lvl>
+    <w:lvl w:ilvl="2" w:tplc="040E001B" w:tentative="1">
+      <w:start w:val="1"/>
+      <w:numFmt w:val="lowerRoman"/>
+      <w:lvlText w:val="%3."/>
+      <w:lvlJc w:val="right"/>
+      <w:pPr>
+        <w:tabs>
+          <w:tab w:val="num" w:pos="2715"/>
+        </w:tabs>
+        <w:ind w:left="2715" w:hanging="180"/>
+      </w:pPr>
+    </w:lvl>
+    <w:lvl w:ilvl="3" w:tplc="040E000F" w:tentative="1">
+      <w:start w:val="1"/>
+      <w:numFmt w:val="decimal"/>
+      <w:lvlText w:val="%4."/>
+      <w:lvlJc w:val="left"/>
+      <w:pPr>
+        <w:tabs>
+          <w:tab w:val="num" w:pos="3435"/>
+        </w:tabs>
+        <w:ind w:left="3435" w:hanging="360"/>
+      </w:pPr>
+    </w:lvl>
+    <w:lvl w:ilvl="4" w:tplc="040E0019" w:tentative="1">
+      <w:start w:val="1"/>
+      <w:numFmt w:val="lowerLetter"/>
+      <w:lvlText w:val="%5."/>
+      <w:lvlJc w:val="left"/>
+      <w:pPr>
+        <w:tabs>
+          <w:tab w:val="num" w:pos="4155"/>
+        </w:tabs>
+        <w:ind w:left="4155" w:hanging="360"/>
+      </w:pPr>
+    </w:lvl>
+    <w:lvl w:ilvl="5" w:tplc="040E001B" w:tentative="1">
+      <w:start w:val="1"/>
+      <w:numFmt w:val="lowerRoman"/>
+      <w:lvlText w:val="%6."/>
+      <w:lvlJc w:val="right"/>
+      <w:pPr>
+        <w:tabs>
+          <w:tab w:val="num" w:pos="4875"/>
+        </w:tabs>
+        <w:ind w:left="4875" w:hanging="180"/>
+      </w:pPr>
+    </w:lvl>
+    <w:lvl w:ilvl="6" w:tplc="040E000F" w:tentative="1">
+      <w:start w:val="1"/>
+      <w:numFmt w:val="decimal"/>
+      <w:lvlText w:val="%7."/>
+      <w:lvlJc w:val="left"/>
+      <w:pPr>
+        <w:tabs>
+          <w:tab w:val="num" w:pos="5595"/>
+        </w:tabs>
+        <w:ind w:left="5595" w:hanging="360"/>
+      </w:pPr>
+    </w:lvl>
+    <w:lvl w:ilvl="7" w:tplc="040E0019" w:tentative="1">
+      <w:start w:val="1"/>
+      <w:numFmt w:val="lowerLetter"/>
+      <w:lvlText w:val="%8."/>
+      <w:lvlJc w:val="left"/>
+      <w:pPr>
+        <w:tabs>
+          <w:tab w:val="num" w:pos="6315"/>
+        </w:tabs>
+        <w:ind w:left="6315" w:hanging="360"/>
+      </w:pPr>
+    </w:lvl>
+    <w:lvl w:ilvl="8" w:tplc="040E001B" w:tentative="1">
+      <w:start w:val="1"/>
+      <w:numFmt w:val="lowerRoman"/>
+      <w:lvlText w:val="%9."/>
+      <w:lvlJc w:val="right"/>
+      <w:pPr>
+        <w:tabs>
+          <w:tab w:val="num" w:pos="7035"/>
+        </w:tabs>
+        <w:ind w:left="7035" w:hanging="180"/>
+      </w:pPr>
+    </w:lvl>
+  </w:abstractNum>
+  <w:abstractNum w:abstractNumId="7" w15:restartNumberingAfterBreak="0">
+    <w:nsid w:val="478616EB"/>
+    <w:multiLevelType w:val="hybridMultilevel"/>
+    <w:tmpl w:val="C0425148"/>
+    <w:lvl w:ilvl="0" w:tplc="040E0011">
+      <w:start w:val="1"/>
+      <w:numFmt w:val="decimal"/>
+      <w:lvlText w:val="%1)"/>
+      <w:lvlJc w:val="left"/>
+      <w:pPr>
+        <w:tabs>
+          <w:tab w:val="num" w:pos="720"/>
+        </w:tabs>
+        <w:ind w:left="720" w:hanging="360"/>
+      </w:pPr>
+      <w:rPr>
+        <w:rFonts w:hint="default"/>
+      </w:rPr>
+    </w:lvl>
+    <w:lvl w:ilvl="1" w:tplc="040E0019" w:tentative="1">
+      <w:start w:val="1"/>
+      <w:numFmt w:val="lowerLetter"/>
+      <w:lvlText w:val="%2."/>
+      <w:lvlJc w:val="left"/>
+      <w:pPr>
+        <w:tabs>
+          <w:tab w:val="num" w:pos="1440"/>
+        </w:tabs>
+        <w:ind w:left="1440" w:hanging="360"/>
+      </w:pPr>
+    </w:lvl>
+    <w:lvl w:ilvl="2" w:tplc="040E001B" w:tentative="1">
+      <w:start w:val="1"/>
+      <w:numFmt w:val="lowerRoman"/>
+      <w:lvlText w:val="%3."/>
+      <w:lvlJc w:val="right"/>
+      <w:pPr>
+        <w:tabs>
+          <w:tab w:val="num" w:pos="2160"/>
+        </w:tabs>
+        <w:ind w:left="2160" w:hanging="180"/>
+      </w:pPr>
+    </w:lvl>
+    <w:lvl w:ilvl="3" w:tplc="040E000F" w:tentative="1">
+      <w:start w:val="1"/>
+      <w:numFmt w:val="decimal"/>
+      <w:lvlText w:val="%4."/>
+      <w:lvlJc w:val="left"/>
+      <w:pPr>
+        <w:tabs>
+          <w:tab w:val="num" w:pos="2880"/>
+        </w:tabs>
+        <w:ind w:left="2880" w:hanging="360"/>
+      </w:pPr>
+    </w:lvl>
+    <w:lvl w:ilvl="4" w:tplc="040E0019" w:tentative="1">
+      <w:start w:val="1"/>
+      <w:numFmt w:val="lowerLetter"/>
+      <w:lvlText w:val="%5."/>
+      <w:lvlJc w:val="left"/>
+      <w:pPr>
+        <w:tabs>
+          <w:tab w:val="num" w:pos="3600"/>
+        </w:tabs>
+        <w:ind w:left="3600" w:hanging="360"/>
+      </w:pPr>
+    </w:lvl>
+    <w:lvl w:ilvl="5" w:tplc="040E001B" w:tentative="1">
+      <w:start w:val="1"/>
+      <w:numFmt w:val="lowerRoman"/>
+      <w:lvlText w:val="%6."/>
+      <w:lvlJc w:val="right"/>
+      <w:pPr>
+        <w:tabs>
+          <w:tab w:val="num" w:pos="4320"/>
+        </w:tabs>
+        <w:ind w:left="4320" w:hanging="180"/>
+      </w:pPr>
+    </w:lvl>
+    <w:lvl w:ilvl="6" w:tplc="040E000F" w:tentative="1">
+      <w:start w:val="1"/>
+      <w:numFmt w:val="decimal"/>
+      <w:lvlText w:val="%7."/>
+      <w:lvlJc w:val="left"/>
+      <w:pPr>
+        <w:tabs>
+          <w:tab w:val="num" w:pos="5040"/>
+        </w:tabs>
+        <w:ind w:left="5040" w:hanging="360"/>
+      </w:pPr>
+    </w:lvl>
+    <w:lvl w:ilvl="7" w:tplc="040E0019" w:tentative="1">
+      <w:start w:val="1"/>
+      <w:numFmt w:val="lowerLetter"/>
+      <w:lvlText w:val="%8."/>
+      <w:lvlJc w:val="left"/>
+      <w:pPr>
+        <w:tabs>
+          <w:tab w:val="num" w:pos="5760"/>
+        </w:tabs>
+        <w:ind w:left="5760" w:hanging="360"/>
+      </w:pPr>
+    </w:lvl>
+    <w:lvl w:ilvl="8" w:tplc="040E001B" w:tentative="1">
+      <w:start w:val="1"/>
+      <w:numFmt w:val="lowerRoman"/>
+      <w:lvlText w:val="%9."/>
+      <w:lvlJc w:val="right"/>
+      <w:pPr>
+        <w:tabs>
+          <w:tab w:val="num" w:pos="6480"/>
+        </w:tabs>
+        <w:ind w:left="6480" w:hanging="180"/>
+      </w:pPr>
+    </w:lvl>
+  </w:abstractNum>
+  <w:abstractNum w:abstractNumId="8" w15:restartNumberingAfterBreak="0">
+    <w:nsid w:val="6B126F98"/>
+    <w:multiLevelType w:val="hybridMultilevel"/>
+    <w:tmpl w:val="80268EC2"/>
+    <w:lvl w:ilvl="0" w:tplc="0440606C">
+      <w:start w:val="2"/>
+      <w:numFmt w:val="bullet"/>
+      <w:lvlText w:val="-"/>
+      <w:lvlJc w:val="left"/>
+      <w:pPr>
+        <w:ind w:left="720" w:hanging="360"/>
+      </w:pPr>
+      <w:rPr>
+        <w:rFonts w:ascii="Times New Roman" w:eastAsia="Times New Roman" w:hAnsi="Times New Roman" w:cs="Times New Roman" w:hint="default"/>
+      </w:rPr>
+    </w:lvl>
+    <w:lvl w:ilvl="1" w:tplc="040E0003" w:tentative="1">
+      <w:start w:val="1"/>
+      <w:numFmt w:val="bullet"/>
+      <w:lvlText w:val="o"/>
+      <w:lvlJc w:val="left"/>
+      <w:pPr>
+        <w:ind w:left="1440" w:hanging="360"/>
+      </w:pPr>
+      <w:rPr>
+        <w:rFonts w:ascii="Courier New" w:hAnsi="Courier New" w:cs="Courier New" w:hint="default"/>
+      </w:rPr>
+    </w:lvl>
+    <w:lvl w:ilvl="2" w:tplc="040E0005" w:tentative="1">
+      <w:start w:val="1"/>
+      <w:numFmt w:val="bullet"/>
+      <w:lvlText w:val=""/>
+      <w:lvlJc w:val="left"/>
+      <w:pPr>
+        <w:ind w:left="2160" w:hanging="360"/>
+      </w:pPr>
+      <w:rPr>
+        <w:rFonts w:ascii="Wingdings" w:hAnsi="Wingdings" w:hint="default"/>
+      </w:rPr>
+    </w:lvl>
+    <w:lvl w:ilvl="3" w:tplc="040E0001" w:tentative="1">
+      <w:start w:val="1"/>
+      <w:numFmt w:val="bullet"/>
+      <w:lvlText w:val=""/>
+      <w:lvlJc w:val="left"/>
+      <w:pPr>
+        <w:ind w:left="2880" w:hanging="360"/>
+      </w:pPr>
+      <w:rPr>
+        <w:rFonts w:ascii="Symbol" w:hAnsi="Symbol" w:hint="default"/>
+      </w:rPr>
+    </w:lvl>
+    <w:lvl w:ilvl="4" w:tplc="040E0003" w:tentative="1">
+      <w:start w:val="1"/>
+      <w:numFmt w:val="bullet"/>
+      <w:lvlText w:val="o"/>
+      <w:lvlJc w:val="left"/>
+      <w:pPr>
+        <w:ind w:left="3600" w:hanging="360"/>
+      </w:pPr>
+      <w:rPr>
+        <w:rFonts w:ascii="Courier New" w:hAnsi="Courier New" w:cs="Courier New" w:hint="default"/>
+      </w:rPr>
+    </w:lvl>
+    <w:lvl w:ilvl="5" w:tplc="040E0005" w:tentative="1">
+      <w:start w:val="1"/>
+      <w:numFmt w:val="bullet"/>
+      <w:lvlText w:val=""/>
+      <w:lvlJc w:val="left"/>
+      <w:pPr>
+        <w:ind w:left="4320" w:hanging="360"/>
+      </w:pPr>
+      <w:rPr>
+        <w:rFonts w:ascii="Wingdings" w:hAnsi="Wingdings" w:hint="default"/>
+      </w:rPr>
+    </w:lvl>
+    <w:lvl w:ilvl="6" w:tplc="040E0001" w:tentative="1">
+      <w:start w:val="1"/>
+      <w:numFmt w:val="bullet"/>
+      <w:lvlText w:val=""/>
+      <w:lvlJc w:val="left"/>
+      <w:pPr>
+        <w:ind w:left="5040" w:hanging="360"/>
+      </w:pPr>
+      <w:rPr>
+        <w:rFonts w:ascii="Symbol" w:hAnsi="Symbol" w:hint="default"/>
+      </w:rPr>
+    </w:lvl>
+    <w:lvl w:ilvl="7" w:tplc="040E0003" w:tentative="1">
+      <w:start w:val="1"/>
+      <w:numFmt w:val="bullet"/>
+      <w:lvlText w:val="o"/>
+      <w:lvlJc w:val="left"/>
+      <w:pPr>
+        <w:ind w:left="5760" w:hanging="360"/>
+      </w:pPr>
+      <w:rPr>
+        <w:rFonts w:ascii="Courier New" w:hAnsi="Courier New" w:cs="Courier New" w:hint="default"/>
+      </w:rPr>
+    </w:lvl>
+    <w:lvl w:ilvl="8" w:tplc="040E0005" w:tentative="1">
+      <w:start w:val="1"/>
+      <w:numFmt w:val="bullet"/>
+      <w:lvlText w:val=""/>
+      <w:lvlJc w:val="left"/>
+      <w:pPr>
+        <w:ind w:left="6480" w:hanging="360"/>
+      </w:pPr>
+      <w:rPr>
+        <w:rFonts w:ascii="Wingdings" w:hAnsi="Wingdings" w:hint="default"/>
+      </w:rPr>
+    </w:lvl>
+  </w:abstractNum>
+  <w:abstractNum w:abstractNumId="9" w15:restartNumberingAfterBreak="0">
     <w:nsid w:val="781349B7"/>
     <w:multiLevelType w:val="multilevel"/>
     <w:tmpl w:val="8DB6F0D4"/>
@@ -5200,7 +6135,123 @@
       </w:pPr>
     </w:lvl>
   </w:abstractNum>
-  <w:abstractNum w:abstractNumId="2" w15:restartNumberingAfterBreak="0">
+  <w:abstractNum w:abstractNumId="10" w15:restartNumberingAfterBreak="0">
+    <w:nsid w:val="79E474F6"/>
+    <w:multiLevelType w:val="hybridMultilevel"/>
+    <w:tmpl w:val="9DCAD250"/>
+    <w:lvl w:ilvl="0" w:tplc="040E0011">
+      <w:start w:val="1"/>
+      <w:numFmt w:val="decimal"/>
+      <w:lvlText w:val="%1)"/>
+      <w:lvlJc w:val="left"/>
+      <w:pPr>
+        <w:tabs>
+          <w:tab w:val="num" w:pos="720"/>
+        </w:tabs>
+        <w:ind w:left="720" w:hanging="360"/>
+      </w:pPr>
+      <w:rPr>
+        <w:rFonts w:hint="default"/>
+      </w:rPr>
+    </w:lvl>
+    <w:lvl w:ilvl="1" w:tplc="040E0019" w:tentative="1">
+      <w:start w:val="1"/>
+      <w:numFmt w:val="lowerLetter"/>
+      <w:lvlText w:val="%2."/>
+      <w:lvlJc w:val="left"/>
+      <w:pPr>
+        <w:tabs>
+          <w:tab w:val="num" w:pos="1440"/>
+        </w:tabs>
+        <w:ind w:left="1440" w:hanging="360"/>
+      </w:pPr>
+    </w:lvl>
+    <w:lvl w:ilvl="2" w:tplc="040E001B" w:tentative="1">
+      <w:start w:val="1"/>
+      <w:numFmt w:val="lowerRoman"/>
+      <w:lvlText w:val="%3."/>
+      <w:lvlJc w:val="right"/>
+      <w:pPr>
+        <w:tabs>
+          <w:tab w:val="num" w:pos="2160"/>
+        </w:tabs>
+        <w:ind w:left="2160" w:hanging="180"/>
+      </w:pPr>
+    </w:lvl>
+    <w:lvl w:ilvl="3" w:tplc="040E000F" w:tentative="1">
+      <w:start w:val="1"/>
+      <w:numFmt w:val="decimal"/>
+      <w:lvlText w:val="%4."/>
+      <w:lvlJc w:val="left"/>
+      <w:pPr>
+        <w:tabs>
+          <w:tab w:val="num" w:pos="2880"/>
+        </w:tabs>
+        <w:ind w:left="2880" w:hanging="360"/>
+      </w:pPr>
+    </w:lvl>
+    <w:lvl w:ilvl="4" w:tplc="040E0019" w:tentative="1">
+      <w:start w:val="1"/>
+      <w:numFmt w:val="lowerLetter"/>
+      <w:lvlText w:val="%5."/>
+      <w:lvlJc w:val="left"/>
+      <w:pPr>
+        <w:tabs>
+          <w:tab w:val="num" w:pos="3600"/>
+        </w:tabs>
+        <w:ind w:left="3600" w:hanging="360"/>
+      </w:pPr>
+    </w:lvl>
+    <w:lvl w:ilvl="5" w:tplc="040E001B" w:tentative="1">
+      <w:start w:val="1"/>
+      <w:numFmt w:val="lowerRoman"/>
+      <w:lvlText w:val="%6."/>
+      <w:lvlJc w:val="right"/>
+      <w:pPr>
+        <w:tabs>
+          <w:tab w:val="num" w:pos="4320"/>
+        </w:tabs>
+        <w:ind w:left="4320" w:hanging="180"/>
+      </w:pPr>
+    </w:lvl>
+    <w:lvl w:ilvl="6" w:tplc="040E000F" w:tentative="1">
+      <w:start w:val="1"/>
+      <w:numFmt w:val="decimal"/>
+      <w:lvlText w:val="%7."/>
+      <w:lvlJc w:val="left"/>
+      <w:pPr>
+        <w:tabs>
+          <w:tab w:val="num" w:pos="5040"/>
+        </w:tabs>
+        <w:ind w:left="5040" w:hanging="360"/>
+      </w:pPr>
+    </w:lvl>
+    <w:lvl w:ilvl="7" w:tplc="040E0019" w:tentative="1">
+      <w:start w:val="1"/>
+      <w:numFmt w:val="lowerLetter"/>
+      <w:lvlText w:val="%8."/>
+      <w:lvlJc w:val="left"/>
+      <w:pPr>
+        <w:tabs>
+          <w:tab w:val="num" w:pos="5760"/>
+        </w:tabs>
+        <w:ind w:left="5760" w:hanging="360"/>
+      </w:pPr>
+    </w:lvl>
+    <w:lvl w:ilvl="8" w:tplc="040E001B" w:tentative="1">
+      <w:start w:val="1"/>
+      <w:numFmt w:val="lowerRoman"/>
+      <w:lvlText w:val="%9."/>
+      <w:lvlJc w:val="right"/>
+      <w:pPr>
+        <w:tabs>
+          <w:tab w:val="num" w:pos="6480"/>
+        </w:tabs>
+        <w:ind w:left="6480" w:hanging="180"/>
+      </w:pPr>
+    </w:lvl>
+  </w:abstractNum>
+  <w:abstractNum w:abstractNumId="11" w15:restartNumberingAfterBreak="0">
     <w:nsid w:val="7A5E3927"/>
     <w:multiLevelType w:val="multilevel"/>
     <w:tmpl w:val="ADCCFC90"/>
@@ -5313,14 +6364,157 @@
       </w:rPr>
     </w:lvl>
   </w:abstractNum>
+  <w:abstractNum w:abstractNumId="12" w15:restartNumberingAfterBreak="0">
+    <w:nsid w:val="7CAE7DF2"/>
+    <w:multiLevelType w:val="hybridMultilevel"/>
+    <w:tmpl w:val="81E81182"/>
+    <w:lvl w:ilvl="0" w:tplc="BE228F5E">
+      <w:start w:val="1"/>
+      <w:numFmt w:val="bullet"/>
+      <w:lvlText w:val="-"/>
+      <w:lvlJc w:val="left"/>
+      <w:pPr>
+        <w:ind w:left="1146" w:hanging="360"/>
+      </w:pPr>
+      <w:rPr>
+        <w:rFonts w:ascii="Times New Roman" w:eastAsia="Times New Roman" w:hAnsi="Times New Roman" w:cs="Times New Roman" w:hint="default"/>
+      </w:rPr>
+    </w:lvl>
+    <w:lvl w:ilvl="1" w:tplc="040E0003" w:tentative="1">
+      <w:start w:val="1"/>
+      <w:numFmt w:val="bullet"/>
+      <w:lvlText w:val="o"/>
+      <w:lvlJc w:val="left"/>
+      <w:pPr>
+        <w:ind w:left="1866" w:hanging="360"/>
+      </w:pPr>
+      <w:rPr>
+        <w:rFonts w:ascii="Courier New" w:hAnsi="Courier New" w:cs="Courier New" w:hint="default"/>
+      </w:rPr>
+    </w:lvl>
+    <w:lvl w:ilvl="2" w:tplc="040E0005" w:tentative="1">
+      <w:start w:val="1"/>
+      <w:numFmt w:val="bullet"/>
+      <w:lvlText w:val=""/>
+      <w:lvlJc w:val="left"/>
+      <w:pPr>
+        <w:ind w:left="2586" w:hanging="360"/>
+      </w:pPr>
+      <w:rPr>
+        <w:rFonts w:ascii="Wingdings" w:hAnsi="Wingdings" w:hint="default"/>
+      </w:rPr>
+    </w:lvl>
+    <w:lvl w:ilvl="3" w:tplc="040E0001" w:tentative="1">
+      <w:start w:val="1"/>
+      <w:numFmt w:val="bullet"/>
+      <w:lvlText w:val=""/>
+      <w:lvlJc w:val="left"/>
+      <w:pPr>
+        <w:ind w:left="3306" w:hanging="360"/>
+      </w:pPr>
+      <w:rPr>
+        <w:rFonts w:ascii="Symbol" w:hAnsi="Symbol" w:hint="default"/>
+      </w:rPr>
+    </w:lvl>
+    <w:lvl w:ilvl="4" w:tplc="040E0003" w:tentative="1">
+      <w:start w:val="1"/>
+      <w:numFmt w:val="bullet"/>
+      <w:lvlText w:val="o"/>
+      <w:lvlJc w:val="left"/>
+      <w:pPr>
+        <w:ind w:left="4026" w:hanging="360"/>
+      </w:pPr>
+      <w:rPr>
+        <w:rFonts w:ascii="Courier New" w:hAnsi="Courier New" w:cs="Courier New" w:hint="default"/>
+      </w:rPr>
+    </w:lvl>
+    <w:lvl w:ilvl="5" w:tplc="040E0005" w:tentative="1">
+      <w:start w:val="1"/>
+      <w:numFmt w:val="bullet"/>
+      <w:lvlText w:val=""/>
+      <w:lvlJc w:val="left"/>
+      <w:pPr>
+        <w:ind w:left="4746" w:hanging="360"/>
+      </w:pPr>
+      <w:rPr>
+        <w:rFonts w:ascii="Wingdings" w:hAnsi="Wingdings" w:hint="default"/>
+      </w:rPr>
+    </w:lvl>
+    <w:lvl w:ilvl="6" w:tplc="040E0001" w:tentative="1">
+      <w:start w:val="1"/>
+      <w:numFmt w:val="bullet"/>
+      <w:lvlText w:val=""/>
+      <w:lvlJc w:val="left"/>
+      <w:pPr>
+        <w:ind w:left="5466" w:hanging="360"/>
+      </w:pPr>
+      <w:rPr>
+        <w:rFonts w:ascii="Symbol" w:hAnsi="Symbol" w:hint="default"/>
+      </w:rPr>
+    </w:lvl>
+    <w:lvl w:ilvl="7" w:tplc="040E0003" w:tentative="1">
+      <w:start w:val="1"/>
+      <w:numFmt w:val="bullet"/>
+      <w:lvlText w:val="o"/>
+      <w:lvlJc w:val="left"/>
+      <w:pPr>
+        <w:ind w:left="6186" w:hanging="360"/>
+      </w:pPr>
+      <w:rPr>
+        <w:rFonts w:ascii="Courier New" w:hAnsi="Courier New" w:cs="Courier New" w:hint="default"/>
+      </w:rPr>
+    </w:lvl>
+    <w:lvl w:ilvl="8" w:tplc="040E0005" w:tentative="1">
+      <w:start w:val="1"/>
+      <w:numFmt w:val="bullet"/>
+      <w:lvlText w:val=""/>
+      <w:lvlJc w:val="left"/>
+      <w:pPr>
+        <w:ind w:left="6906" w:hanging="360"/>
+      </w:pPr>
+      <w:rPr>
+        <w:rFonts w:ascii="Wingdings" w:hAnsi="Wingdings" w:hint="default"/>
+      </w:rPr>
+    </w:lvl>
+  </w:abstractNum>
   <w:num w:numId="1" w16cid:durableId="2030259248">
+    <w:abstractNumId w:val="11"/>
+  </w:num>
+  <w:num w:numId="2" w16cid:durableId="1005476550">
+    <w:abstractNumId w:val="1"/>
+  </w:num>
+  <w:num w:numId="3" w16cid:durableId="63768831">
+    <w:abstractNumId w:val="9"/>
+  </w:num>
+  <w:num w:numId="4" w16cid:durableId="743142959">
+    <w:abstractNumId w:val="3"/>
+  </w:num>
+  <w:num w:numId="5" w16cid:durableId="1025786087">
+    <w:abstractNumId w:val="10"/>
+  </w:num>
+  <w:num w:numId="6" w16cid:durableId="1094939928">
+    <w:abstractNumId w:val="7"/>
+  </w:num>
+  <w:num w:numId="7" w16cid:durableId="1147894306">
+    <w:abstractNumId w:val="6"/>
+  </w:num>
+  <w:num w:numId="8" w16cid:durableId="839082190">
+    <w:abstractNumId w:val="4"/>
+  </w:num>
+  <w:num w:numId="9" w16cid:durableId="636031167">
+    <w:abstractNumId w:val="0"/>
+  </w:num>
+  <w:num w:numId="10" w16cid:durableId="438180927">
+    <w:abstractNumId w:val="8"/>
+  </w:num>
+  <w:num w:numId="11" w16cid:durableId="1473713240">
     <w:abstractNumId w:val="2"/>
   </w:num>
-  <w:num w:numId="2" w16cid:durableId="1005476550">
-    <w:abstractNumId w:val="0"/>
+  <w:num w:numId="12" w16cid:durableId="1641685482">
+    <w:abstractNumId w:val="5"/>
   </w:num>
-  <w:num w:numId="3" w16cid:durableId="63768831">
-    <w:abstractNumId w:val="1"/>
+  <w:num w:numId="13" w16cid:durableId="719282771">
+    <w:abstractNumId w:val="12"/>
   </w:num>
 </w:numbering>
 </file>
@@ -6177,6 +7371,27 @@
       </w:tblCellMar>
     </w:tblPr>
   </w:style>
+  <w:style w:type="paragraph" w:styleId="lfej">
+    <w:name w:val="header"/>
+    <w:basedOn w:val="Norml"/>
+    <w:link w:val="lfejChar"/>
+    <w:uiPriority w:val="99"/>
+    <w:unhideWhenUsed/>
+    <w:rsid w:val="000F62F0"/>
+    <w:pPr>
+      <w:tabs>
+        <w:tab w:val="center" w:pos="4536"/>
+        <w:tab w:val="right" w:pos="9072"/>
+      </w:tabs>
+    </w:pPr>
+  </w:style>
+  <w:style w:type="character" w:customStyle="1" w:styleId="lfejChar">
+    <w:name w:val="Élőfej Char"/>
+    <w:basedOn w:val="Bekezdsalapbettpusa"/>
+    <w:link w:val="lfej"/>
+    <w:uiPriority w:val="99"/>
+    <w:rsid w:val="000F62F0"/>
+  </w:style>
 </w:styles>
 </file>
 
@@ -6469,19 +7684,266 @@
   <a:extraClrSchemeLst/>
   <a:extLst>
     <a:ext uri="[[05A4C25C-085E-4340-85A3-A5531E510DB2]]">
-      <thm15:themeFamily xmlns:thm15="http://schemas.microsoft.com/office/thememl/2012/main" xmlns="" name="Office Theme" id="[[62F939B6-93AF-4DB8-9C6B-D6C7DFDC589F]]" vid="[[4A3C46E8-61CC-4603-A589-7422A47A8E4A]]"/>
+      <thm15:themeFamily xmlns="" xmlns:thm15="http://schemas.microsoft.com/office/thememl/2012/main" name="Office Theme" id="[[62F939B6-93AF-4DB8-9C6B-D6C7DFDC589F]]" vid="[[4A3C46E8-61CC-4603-A589-7422A47A8E4A]]"/>
     </a:ext>
   </a:extLst>
 </a:theme>
 </file>
 
 <file path=customXml/item1.xml><?xml version="1.0" encoding="utf-8"?>
+<ct:contentTypeSchema xmlns:ct="http://schemas.microsoft.com/office/2006/metadata/contentType" xmlns:ma="http://schemas.microsoft.com/office/2006/metadata/properties/metaAttributes" ct:_="" ma:_="" ma:contentTypeName="Dokumentum" ma:contentTypeID="0x010100E4BAA770ADAE4D439C66EF13890A04B8" ma:contentTypeVersion="10" ma:contentTypeDescription="Új dokumentum létrehozása." ma:contentTypeScope="" ma:versionID="f68fb5ccb0e8075d3889d5adaafd2592">
+  <xsd:schema xmlns:xsd="http://www.w3.org/2001/XMLSchema" xmlns:xs="http://www.w3.org/2001/XMLSchema" xmlns:p="http://schemas.microsoft.com/office/2006/metadata/properties" xmlns:ns2="f350aa17-6148-4ccf-8ed7-aab0d8e53e1e" xmlns:ns3="99234562-d989-485b-a0ab-4c1584206016" targetNamespace="http://schemas.microsoft.com/office/2006/metadata/properties" ma:root="true" ma:fieldsID="1f815d7e34db227c09c850f6036026a7" ns2:_="" ns3:_="">
+    <xsd:import namespace="f350aa17-6148-4ccf-8ed7-aab0d8e53e1e"/>
+    <xsd:import namespace="99234562-d989-485b-a0ab-4c1584206016"/>
+    <xsd:element name="properties">
+      <xsd:complexType>
+        <xsd:sequence>
+          <xsd:element name="documentManagement">
+            <xsd:complexType>
+              <xsd:all>
+                <xsd:element ref="ns2:MediaServiceMetadata" minOccurs="0"/>
+                <xsd:element ref="ns2:MediaServiceFastMetadata" minOccurs="0"/>
+                <xsd:element ref="ns2:MediaServiceSearchProperties" minOccurs="0"/>
+                <xsd:element ref="ns2:MediaServiceDateTaken" minOccurs="0"/>
+                <xsd:element ref="ns2:MediaServiceGenerationTime" minOccurs="0"/>
+                <xsd:element ref="ns2:MediaServiceEventHashCode" minOccurs="0"/>
+                <xsd:element ref="ns2:lcf76f155ced4ddcb4097134ff3c332f" minOccurs="0"/>
+                <xsd:element ref="ns3:TaxCatchAll" minOccurs="0"/>
+                <xsd:element ref="ns2:MediaServiceOCR" minOccurs="0"/>
+              </xsd:all>
+            </xsd:complexType>
+          </xsd:element>
+        </xsd:sequence>
+      </xsd:complexType>
+    </xsd:element>
+  </xsd:schema>
+  <xsd:schema xmlns:xsd="http://www.w3.org/2001/XMLSchema" xmlns:xs="http://www.w3.org/2001/XMLSchema" xmlns:dms="http://schemas.microsoft.com/office/2006/documentManagement/types" xmlns:pc="http://schemas.microsoft.com/office/infopath/2007/PartnerControls" targetNamespace="f350aa17-6148-4ccf-8ed7-aab0d8e53e1e" elementFormDefault="qualified">
+    <xsd:import namespace="http://schemas.microsoft.com/office/2006/documentManagement/types"/>
+    <xsd:import namespace="http://schemas.microsoft.com/office/infopath/2007/PartnerControls"/>
+    <xsd:element name="MediaServiceMetadata" ma:index="8" nillable="true" ma:displayName="MediaServiceMetadata" ma:hidden="true" ma:internalName="MediaServiceMetadata" ma:readOnly="true">
+      <xsd:simpleType>
+        <xsd:restriction base="dms:Note"/>
+      </xsd:simpleType>
+    </xsd:element>
+    <xsd:element name="MediaServiceFastMetadata" ma:index="9" nillable="true" ma:displayName="MediaServiceFastMetadata" ma:hidden="true" ma:internalName="MediaServiceFastMetadata" ma:readOnly="true">
+      <xsd:simpleType>
+        <xsd:restriction base="dms:Note"/>
+      </xsd:simpleType>
+    </xsd:element>
+    <xsd:element name="MediaServiceSearchProperties" ma:index="10" nillable="true" ma:displayName="MediaServiceSearchProperties" ma:hidden="true" ma:internalName="MediaServiceSearchProperties" ma:readOnly="true">
+      <xsd:simpleType>
+        <xsd:restriction base="dms:Note"/>
+      </xsd:simpleType>
+    </xsd:element>
+    <xsd:element name="MediaServiceDateTaken" ma:index="11" nillable="true" ma:displayName="MediaServiceDateTaken" ma:hidden="true" ma:indexed="true" ma:internalName="MediaServiceDateTaken" ma:readOnly="true">
+      <xsd:simpleType>
+        <xsd:restriction base="dms:Text"/>
+      </xsd:simpleType>
+    </xsd:element>
+    <xsd:element name="MediaServiceGenerationTime" ma:index="12" nillable="true" ma:displayName="MediaServiceGenerationTime" ma:hidden="true" ma:internalName="MediaServiceGenerationTime" ma:readOnly="true">
+      <xsd:simpleType>
+        <xsd:restriction base="dms:Text"/>
+      </xsd:simpleType>
+    </xsd:element>
+    <xsd:element name="MediaServiceEventHashCode" ma:index="13" nillable="true" ma:displayName="MediaServiceEventHashCode" ma:hidden="true" ma:internalName="MediaServiceEventHashCode" ma:readOnly="true">
+      <xsd:simpleType>
+        <xsd:restriction base="dms:Text"/>
+      </xsd:simpleType>
+    </xsd:element>
+    <xsd:element name="lcf76f155ced4ddcb4097134ff3c332f" ma:index="15" nillable="true" ma:taxonomy="true" ma:internalName="lcf76f155ced4ddcb4097134ff3c332f" ma:taxonomyFieldName="MediaServiceImageTags" ma:displayName="Képcímkék" ma:readOnly="false" ma:fieldId="{5cf76f15-5ced-4ddc-b409-7134ff3c332f}" ma:taxonomyMulti="true" ma:sspId="0b97e42f-64b5-4dc7-95f4-6f1d9f140e03" ma:termSetId="09814cd3-568e-fe90-9814-8d621ff8fb84" ma:anchorId="fba54fb3-c3e1-fe81-a776-ca4b69148c4d" ma:open="true" ma:isKeyword="false">
+      <xsd:complexType>
+        <xsd:sequence>
+          <xsd:element ref="pc:Terms" minOccurs="0" maxOccurs="1"/>
+        </xsd:sequence>
+      </xsd:complexType>
+    </xsd:element>
+    <xsd:element name="MediaServiceOCR" ma:index="17" nillable="true" ma:displayName="Extracted Text" ma:internalName="MediaServiceOCR" ma:readOnly="true">
+      <xsd:simpleType>
+        <xsd:restriction base="dms:Note">
+          <xsd:maxLength value="255"/>
+        </xsd:restriction>
+      </xsd:simpleType>
+    </xsd:element>
+  </xsd:schema>
+  <xsd:schema xmlns:xsd="http://www.w3.org/2001/XMLSchema" xmlns:xs="http://www.w3.org/2001/XMLSchema" xmlns:dms="http://schemas.microsoft.com/office/2006/documentManagement/types" xmlns:pc="http://schemas.microsoft.com/office/infopath/2007/PartnerControls" targetNamespace="99234562-d989-485b-a0ab-4c1584206016" elementFormDefault="qualified">
+    <xsd:import namespace="http://schemas.microsoft.com/office/2006/documentManagement/types"/>
+    <xsd:import namespace="http://schemas.microsoft.com/office/infopath/2007/PartnerControls"/>
+    <xsd:element name="TaxCatchAll" ma:index="16" nillable="true" ma:displayName="Taxonomy Catch All Column" ma:hidden="true" ma:list="{c513404d-a4d0-4ce6-91ab-c93177d4ccd1}" ma:internalName="TaxCatchAll" ma:showField="CatchAllData" ma:web="99234562-d989-485b-a0ab-4c1584206016">
+      <xsd:complexType>
+        <xsd:complexContent>
+          <xsd:extension base="dms:MultiChoiceLookup">
+            <xsd:sequence>
+              <xsd:element name="Value" type="dms:Lookup" maxOccurs="unbounded" minOccurs="0" nillable="true"/>
+            </xsd:sequence>
+          </xsd:extension>
+        </xsd:complexContent>
+      </xsd:complexType>
+    </xsd:element>
+  </xsd:schema>
+  <xsd:schema xmlns="http://schemas.openxmlformats.org/package/2006/metadata/core-properties" xmlns:xsd="http://www.w3.org/2001/XMLSchema" xmlns:xsi="http://www.w3.org/2001/XMLSchema-instance" xmlns:dc="http://purl.org/dc/elements/1.1/" xmlns:dcterms="http://purl.org/dc/terms/" xmlns:odoc="http://schemas.microsoft.com/internal/obd" targetNamespace="http://schemas.openxmlformats.org/package/2006/metadata/core-properties" elementFormDefault="qualified" attributeFormDefault="unqualified" blockDefault="#all">
+    <xsd:import namespace="http://purl.org/dc/elements/1.1/" schemaLocation="http://dublincore.org/schemas/xmls/qdc/2003/04/02/dc.xsd"/>
+    <xsd:import namespace="http://purl.org/dc/terms/" schemaLocation="http://dublincore.org/schemas/xmls/qdc/2003/04/02/dcterms.xsd"/>
+    <xsd:element name="coreProperties" type="CT_coreProperties"/>
+    <xsd:complexType name="CT_coreProperties">
+      <xsd:all>
+        <xsd:element ref="dc:creator" minOccurs="0" maxOccurs="1"/>
+        <xsd:element ref="dcterms:created" minOccurs="0" maxOccurs="1"/>
+        <xsd:element ref="dc:identifier" minOccurs="0" maxOccurs="1"/>
+        <xsd:element name="contentType" minOccurs="0" maxOccurs="1" type="xsd:string" ma:index="0" ma:displayName="Tartalomtípus"/>
+        <xsd:element ref="dc:title" minOccurs="0" maxOccurs="1" ma:index="4" ma:displayName="Cím"/>
+        <xsd:element ref="dc:subject" minOccurs="0" maxOccurs="1"/>
+        <xsd:element ref="dc:description" minOccurs="0" maxOccurs="1"/>
+        <xsd:element name="keywords" minOccurs="0" maxOccurs="1" type="xsd:string"/>
+        <xsd:element ref="dc:language" minOccurs="0" maxOccurs="1"/>
+        <xsd:element name="category" minOccurs="0" maxOccurs="1" type="xsd:string"/>
+        <xsd:element name="version" minOccurs="0" maxOccurs="1" type="xsd:string"/>
+        <xsd:element name="revision" minOccurs="0" maxOccurs="1" type="xsd:string">
+          <xsd:annotation>
+            <xsd:documentation>
+                        This value indicates the number of saves or revisions. The application is responsible for updating this value after each revision.
+                    </xsd:documentation>
+          </xsd:annotation>
+        </xsd:element>
+        <xsd:element name="lastModifiedBy" minOccurs="0" maxOccurs="1" type="xsd:string"/>
+        <xsd:element ref="dcterms:modified" minOccurs="0" maxOccurs="1"/>
+        <xsd:element name="contentStatus" minOccurs="0" maxOccurs="1" type="xsd:string"/>
+      </xsd:all>
+    </xsd:complexType>
+  </xsd:schema>
+  <xs:schema xmlns:pc="http://schemas.microsoft.com/office/infopath/2007/PartnerControls" xmlns:xs="http://www.w3.org/2001/XMLSchema" targetNamespace="http://schemas.microsoft.com/office/infopath/2007/PartnerControls" elementFormDefault="qualified" attributeFormDefault="unqualified">
+    <xs:element name="Person">
+      <xs:complexType>
+        <xs:sequence>
+          <xs:element ref="pc:DisplayName" minOccurs="0"/>
+          <xs:element ref="pc:AccountId" minOccurs="0"/>
+          <xs:element ref="pc:AccountType" minOccurs="0"/>
+        </xs:sequence>
+      </xs:complexType>
+    </xs:element>
+    <xs:element name="DisplayName" type="xs:string"/>
+    <xs:element name="AccountId" type="xs:string"/>
+    <xs:element name="AccountType" type="xs:string"/>
+    <xs:element name="BDCAssociatedEntity">
+      <xs:complexType>
+        <xs:sequence>
+          <xs:element ref="pc:BDCEntity" minOccurs="0" maxOccurs="unbounded"/>
+        </xs:sequence>
+        <xs:attribute ref="pc:EntityNamespace"/>
+        <xs:attribute ref="pc:EntityName"/>
+        <xs:attribute ref="pc:SystemInstanceName"/>
+        <xs:attribute ref="pc:AssociationName"/>
+      </xs:complexType>
+    </xs:element>
+    <xs:attribute name="EntityNamespace" type="xs:string"/>
+    <xs:attribute name="EntityName" type="xs:string"/>
+    <xs:attribute name="SystemInstanceName" type="xs:string"/>
+    <xs:attribute name="AssociationName" type="xs:string"/>
+    <xs:element name="BDCEntity">
+      <xs:complexType>
+        <xs:sequence>
+          <xs:element ref="pc:EntityDisplayName" minOccurs="0"/>
+          <xs:element ref="pc:EntityInstanceReference" minOccurs="0"/>
+          <xs:element ref="pc:EntityId1" minOccurs="0"/>
+          <xs:element ref="pc:EntityId2" minOccurs="0"/>
+          <xs:element ref="pc:EntityId3" minOccurs="0"/>
+          <xs:element ref="pc:EntityId4" minOccurs="0"/>
+          <xs:element ref="pc:EntityId5" minOccurs="0"/>
+        </xs:sequence>
+      </xs:complexType>
+    </xs:element>
+    <xs:element name="EntityDisplayName" type="xs:string"/>
+    <xs:element name="EntityInstanceReference" type="xs:string"/>
+    <xs:element name="EntityId1" type="xs:string"/>
+    <xs:element name="EntityId2" type="xs:string"/>
+    <xs:element name="EntityId3" type="xs:string"/>
+    <xs:element name="EntityId4" type="xs:string"/>
+    <xs:element name="EntityId5" type="xs:string"/>
+    <xs:element name="Terms">
+      <xs:complexType>
+        <xs:sequence>
+          <xs:element ref="pc:TermInfo" minOccurs="0" maxOccurs="unbounded"/>
+        </xs:sequence>
+      </xs:complexType>
+    </xs:element>
+    <xs:element name="TermInfo">
+      <xs:complexType>
+        <xs:sequence>
+          <xs:element ref="pc:TermName" minOccurs="0"/>
+          <xs:element ref="pc:TermId" minOccurs="0"/>
+        </xs:sequence>
+      </xs:complexType>
+    </xs:element>
+    <xs:element name="TermName" type="xs:string"/>
+    <xs:element name="TermId" type="xs:string"/>
+  </xs:schema>
+</ct:contentTypeSchema>
+</file>
+
+<file path=customXml/item2.xml><?xml version="1.0" encoding="utf-8"?>
+<?mso-contentType ?>
+<FormTemplates xmlns="http://schemas.microsoft.com/sharepoint/v3/contenttype/forms">
+  <Display>DocumentLibraryForm</Display>
+  <Edit>DocumentLibraryForm</Edit>
+  <New>DocumentLibraryForm</New>
+</FormTemplates>
+</file>
+
+<file path=customXml/item3.xml><?xml version="1.0" encoding="utf-8"?>
+<p:properties xmlns:p="http://schemas.microsoft.com/office/2006/metadata/properties" xmlns:xsi="http://www.w3.org/2001/XMLSchema-instance" xmlns:pc="http://schemas.microsoft.com/office/infopath/2007/PartnerControls">
+  <documentManagement>
+    <lcf76f155ced4ddcb4097134ff3c332f xmlns="f350aa17-6148-4ccf-8ed7-aab0d8e53e1e">
+      <Terms xmlns="http://schemas.microsoft.com/office/infopath/2007/PartnerControls"/>
+    </lcf76f155ced4ddcb4097134ff3c332f>
+    <TaxCatchAll xmlns="99234562-d989-485b-a0ab-4c1584206016" xsi:nil="true"/>
+  </documentManagement>
+</p:properties>
+</file>
+
+<file path=customXml/item4.xml><?xml version="1.0" encoding="utf-8"?>
 <go:gDocsCustomXmlDataStorage xmlns:go="http://customooxmlschemas.google.com/" xmlns:r="http://schemas.openxmlformats.org/officeDocument/2006/relationships" uri="GoogleDocsCustomDataVersion2">
   <go:docsCustomData xmlns:go="http://customooxmlschemas.google.com/" roundtripDataSignature="AMtx7mh3pW/99loWVb9MzmptONPVoLDGlg==">CgMxLjA4AHIhMTlPNXBsaU5KandrYVVwYlJKTUs0YWt5Q2F3clVlWFd5</go:docsCustomData>
 </go:gDocsCustomXmlDataStorage>
 </file>
 
 <file path=customXml/itemProps1.xml><?xml version="1.0" encoding="utf-8"?>
+<ds:datastoreItem xmlns:ds="http://schemas.openxmlformats.org/officeDocument/2006/customXml" ds:itemID="{D3E9A971-969C-47A7-BAB7-B53999EA49BA}">
+  <ds:schemaRefs>
+    <ds:schemaRef ds:uri="http://schemas.microsoft.com/office/2006/metadata/contentType"/>
+    <ds:schemaRef ds:uri="http://schemas.microsoft.com/office/2006/metadata/properties/metaAttributes"/>
+    <ds:schemaRef ds:uri="http://www.w3.org/2001/XMLSchema"/>
+    <ds:schemaRef ds:uri="http://schemas.microsoft.com/office/2006/metadata/properties"/>
+    <ds:schemaRef ds:uri="f350aa17-6148-4ccf-8ed7-aab0d8e53e1e"/>
+    <ds:schemaRef ds:uri="99234562-d989-485b-a0ab-4c1584206016"/>
+    <ds:schemaRef ds:uri="http://schemas.microsoft.com/office/2006/documentManagement/types"/>
+    <ds:schemaRef ds:uri="http://schemas.microsoft.com/office/infopath/2007/PartnerControls"/>
+    <ds:schemaRef ds:uri="http://schemas.openxmlformats.org/package/2006/metadata/core-properties"/>
+    <ds:schemaRef ds:uri="http://purl.org/dc/elements/1.1/"/>
+    <ds:schemaRef ds:uri="http://purl.org/dc/terms/"/>
+    <ds:schemaRef ds:uri="http://schemas.microsoft.com/internal/obd"/>
+  </ds:schemaRefs>
+</ds:datastoreItem>
+</file>
+
+<file path=customXml/itemProps2.xml><?xml version="1.0" encoding="utf-8"?>
+<ds:datastoreItem xmlns:ds="http://schemas.openxmlformats.org/officeDocument/2006/customXml" ds:itemID="{B34B391C-7BB0-48C4-B26C-B5520BB511A9}">
+  <ds:schemaRefs>
+    <ds:schemaRef ds:uri="http://schemas.microsoft.com/sharepoint/v3/contenttype/forms"/>
+  </ds:schemaRefs>
+</ds:datastoreItem>
+</file>
+
+<file path=customXml/itemProps3.xml><?xml version="1.0" encoding="utf-8"?>
+<ds:datastoreItem xmlns:ds="http://schemas.openxmlformats.org/officeDocument/2006/customXml" ds:itemID="{06D54AE2-4ABF-4635-8E1C-BD750DD73BDF}">
+  <ds:schemaRefs>
+    <ds:schemaRef ds:uri="http://schemas.microsoft.com/office/2006/metadata/properties"/>
+    <ds:schemaRef ds:uri="http://schemas.microsoft.com/office/infopath/2007/PartnerControls"/>
+    <ds:schemaRef ds:uri="f350aa17-6148-4ccf-8ed7-aab0d8e53e1e"/>
+    <ds:schemaRef ds:uri="99234562-d989-485b-a0ab-4c1584206016"/>
+  </ds:schemaRefs>
+</ds:datastoreItem>
+</file>
+
+<file path=customXml/itemProps4.xml><?xml version="1.0" encoding="utf-8"?>
 <ds:datastoreItem xmlns:ds="http://schemas.openxmlformats.org/officeDocument/2006/customXml" ds:itemID="{653E2A52-5057-4605-B66F-B23CD4C9A05D}">
   <ds:schemaRefs>
     <ds:schemaRef ds:uri="http://customooxmlschemas.google.com/"/>

</xml_diff>